<commit_message>
Freeze Chapter 2 v1.0 gold standard
External decision APPROVE PROPAGATION. Metadata-only freeze on 2026-10-06; classroom instructional bytes are unchanged.

Co-authored-by: Cursor <cursoragent@cursor.com>
</commit_message>
<xml_diff>
--- a/production/premium-notes/02-ch2-moving-objects-have-energy-guided-notes.docx
+++ b/production/premium-notes/02-ch2-moving-objects-have-energy-guided-notes.docx
@@ -4,79 +4,195 @@
   <w:body>
     <w:p>
       <w:pPr>
-        <w:jc w:val="center"/>
+        <w:spacing w:before="0" w:after="80"/>
       </w:pPr>
       <w:r>
         <w:rPr>
-          <w:rFonts w:ascii="Cambria" w:hAnsi="Cambria" w:cs="Cambria"/>
+          <w:rFonts w:ascii="Avenir Next" w:hAnsi="Avenir Next"/>
           <w:b/>
           <w:i w:val="0"/>
-          <w:color w:val="2F3C7E"/>
-          <w:sz w:val="46"/>
+          <w:color w:val="4A5268"/>
+          <w:sz w:val="19"/>
+          <w:u w:val="none"/>
+          <w:rFonts w:ascii="Avenir Next" w:hAnsi="Avenir Next" w:cs="Avenir Next"/>
         </w:rPr>
-        <w:t>Moving Objects Have Energy</w:t>
+        <w:t>UNIT 1 · ENERGY TRANSFER &amp; TRANSFORMATION</w:t>
       </w:r>
     </w:p>
     <w:p>
       <w:pPr>
-        <w:jc w:val="center"/>
+        <w:spacing w:before="0" w:after="40"/>
       </w:pPr>
       <w:r>
         <w:rPr>
-          <w:rFonts w:ascii="Calibri" w:hAnsi="Calibri" w:cs="Calibri"/>
-          <w:b w:val="0"/>
-          <w:i/>
-          <w:color w:val="555555"/>
-          <w:sz w:val="24"/>
+          <w:sz w:val="4"/>
         </w:rPr>
-        <w:t>Chapter 2 Guided Notes · Grade 4 Energy Transfer &amp; Transformation</w:t>
       </w:r>
     </w:p>
     <w:p>
       <w:pPr>
-        <w:spacing w:after="40"/>
+        <w:spacing w:before="0" w:after="40"/>
       </w:pPr>
       <w:r>
         <w:rPr>
-          <w:rFonts w:ascii="Calibri" w:hAnsi="Calibri" w:cs="Calibri"/>
+          <w:rFonts w:ascii="Avenir Next" w:hAnsi="Avenir Next"/>
           <w:b/>
           <w:i w:val="0"/>
-          <w:color w:val="1F1F1F"/>
+          <w:color w:val="0F5A5C"/>
+          <w:sz w:val="46"/>
+          <w:u w:val="none"/>
+          <w:rFonts w:ascii="Avenir Next" w:hAnsi="Avenir Next" w:cs="Avenir Next"/>
+        </w:rPr>
+        <w:t>Chapter 2 · Moving Objects Have Energy</w:t>
+      </w:r>
+    </w:p>
+    <w:tbl>
+      <w:tblPr>
+        <w:tblW w:type="auto" w:w="0"/>
+        <w:tblLook w:firstColumn="1" w:firstRow="1" w:lastColumn="0" w:lastRow="0" w:noHBand="0" w:noVBand="1" w:val="04A0"/>
+        <w:jc w:val="center"/>
+        <w:tblBorders>
+          <w:top w:val="none"/>
+          <w:left w:val="none"/>
+          <w:bottom w:val="none"/>
+          <w:right w:val="none"/>
+          <w:insideH w:val="none"/>
+          <w:insideV w:val="none"/>
+        </w:tblBorders>
+      </w:tblPr>
+      <w:tblGrid>
+        <w:gridCol w:w="10656"/>
+      </w:tblGrid>
+      <w:tr>
+        <w:tc>
+          <w:tcPr>
+            <w:tcW w:type="dxa" w:w="3024"/>
+            <w:tcMar>
+              <w:top w:w="35" w:type="dxa"/>
+              <w:left w:w="50" w:type="dxa"/>
+              <w:bottom w:w="35" w:type="dxa"/>
+              <w:right w:w="50" w:type="dxa"/>
+            </w:tcMar>
+            <w:shd w:val="clear" w:color="auto" w:fill="1A1D26"/>
+            <w:vAlign w:val="center"/>
+          </w:tcPr>
+          <w:p>
+            <w:pPr>
+              <w:jc w:val="center"/>
+            </w:pPr>
+            <w:r>
+              <w:rPr>
+                <w:rFonts w:ascii="Avenir Next" w:hAnsi="Avenir Next"/>
+                <w:b/>
+                <w:i w:val="0"/>
+                <w:color w:val="FFFFFF"/>
+                <w:sz w:val="19"/>
+                <w:u w:val="none"/>
+                <w:rFonts w:ascii="Avenir Next" w:hAnsi="Avenir Next" w:cs="Avenir Next"/>
+              </w:rPr>
+              <w:t>GUIDED NOTES</w:t>
+            </w:r>
+          </w:p>
+        </w:tc>
+      </w:tr>
+    </w:tbl>
+    <w:p>
+      <w:pPr>
+        <w:spacing w:before="0" w:after="80"/>
+      </w:pPr>
+      <w:r>
+        <w:rPr>
+          <w:sz w:val="4"/>
+        </w:rPr>
+      </w:r>
+    </w:p>
+    <w:p>
+      <w:pPr>
+        <w:spacing w:before="0" w:after="800" w:line="520" w:lineRule="exact"/>
+      </w:pPr>
+      <w:r>
+        <w:rPr>
+          <w:rFonts w:ascii="Avenir Next" w:hAnsi="Avenir Next"/>
+          <w:b/>
+          <w:i w:val="0"/>
+          <w:color w:val="1A1D26"/>
           <w:sz w:val="24"/>
+          <w:u w:val="none"/>
+          <w:rFonts w:ascii="Avenir Next" w:hAnsi="Avenir Next" w:cs="Avenir Next"/>
         </w:rPr>
         <w:t xml:space="preserve">Name: </w:t>
       </w:r>
       <w:r>
         <w:rPr>
-          <w:rFonts w:ascii="Calibri" w:hAnsi="Calibri" w:cs="Calibri"/>
+          <w:rFonts w:ascii="Avenir Next" w:hAnsi="Avenir Next"/>
           <w:b w:val="0"/>
           <w:i w:val="0"/>
-          <w:color w:val="1F1F1F"/>
+          <w:color w:val="1A1D26"/>
           <w:sz w:val="24"/>
           <w:u w:val="single"/>
+          <w:rFonts w:ascii="Avenir Next" w:hAnsi="Avenir Next" w:cs="Avenir Next"/>
         </w:rPr>
-        <w:t>____________________________</w:t>
+        <w:t>__________________________</w:t>
       </w:r>
       <w:r>
         <w:rPr>
-          <w:rFonts w:ascii="Calibri" w:hAnsi="Calibri" w:cs="Calibri"/>
+          <w:rFonts w:ascii="Avenir Next" w:hAnsi="Avenir Next"/>
           <w:b/>
           <w:i w:val="0"/>
-          <w:color w:val="1F1F1F"/>
+          <w:color w:val="1A1D26"/>
           <w:sz w:val="24"/>
+          <w:u w:val="none"/>
+          <w:rFonts w:ascii="Avenir Next" w:hAnsi="Avenir Next" w:cs="Avenir Next"/>
         </w:rPr>
-        <w:t xml:space="preserve">      Date: </w:t>
+        <w:t xml:space="preserve">     Homeroom:  </w:t>
       </w:r>
       <w:r>
         <w:rPr>
-          <w:rFonts w:ascii="Calibri" w:hAnsi="Calibri" w:cs="Calibri"/>
+          <w:rFonts w:ascii="Avenir Next" w:hAnsi="Avenir Next"/>
           <w:b w:val="0"/>
           <w:i w:val="0"/>
-          <w:color w:val="1F1F1F"/>
+          <w:color w:val="1A1D26"/>
           <w:sz w:val="24"/>
-          <w:u w:val="single"/>
+          <w:u w:val="none"/>
+          <w:rFonts w:ascii="Avenir Next" w:hAnsi="Avenir Next" w:cs="Avenir Next"/>
         </w:rPr>
-        <w:t>________________</w:t>
+        <w:t>○  4A</w:t>
+      </w:r>
+      <w:r>
+        <w:rPr>
+          <w:rFonts w:ascii="Avenir Next" w:hAnsi="Avenir Next"/>
+          <w:b w:val="0"/>
+          <w:i w:val="0"/>
+          <w:color w:val="1A1D26"/>
+          <w:sz w:val="24"/>
+          <w:u w:val="none"/>
+          <w:rFonts w:ascii="Avenir Next" w:hAnsi="Avenir Next" w:cs="Avenir Next"/>
+        </w:rPr>
+        <w:t xml:space="preserve">  ○  4B</w:t>
+      </w:r>
+      <w:r>
+        <w:rPr>
+          <w:rFonts w:ascii="Avenir Next" w:hAnsi="Avenir Next"/>
+          <w:b w:val="0"/>
+          <w:i w:val="0"/>
+          <w:color w:val="1A1D26"/>
+          <w:sz w:val="24"/>
+          <w:u w:val="none"/>
+          <w:rFonts w:ascii="Avenir Next" w:hAnsi="Avenir Next" w:cs="Avenir Next"/>
+        </w:rPr>
+        <w:t xml:space="preserve">  ○  4C</w:t>
+      </w:r>
+      <w:r>
+        <w:rPr>
+          <w:rFonts w:ascii="Avenir Next" w:hAnsi="Avenir Next"/>
+          <w:b w:val="0"/>
+          <w:i w:val="0"/>
+          <w:color w:val="1A1D26"/>
+          <w:sz w:val="24"/>
+          <w:u w:val="none"/>
+          <w:rFonts w:ascii="Avenir Next" w:hAnsi="Avenir Next" w:cs="Avenir Next"/>
+        </w:rPr>
+        <w:t xml:space="preserve">  ○  4D</w:t>
       </w:r>
     </w:p>
     <w:tbl>
@@ -84,50 +200,42 @@
         <w:tblW w:type="auto" w:w="0"/>
         <w:tblLook w:firstColumn="1" w:firstRow="1" w:lastColumn="0" w:lastRow="0" w:noHBand="0" w:noVBand="1" w:val="04A0"/>
         <w:tblBorders>
-          <w:top w:val="none" w:sz="0" w:space="0" w:color="FFFFFF"/>
-          <w:left w:val="none" w:sz="0" w:space="0" w:color="FFFFFF"/>
-          <w:bottom w:val="none" w:sz="0" w:space="0" w:color="FFFFFF"/>
-          <w:right w:val="none" w:sz="0" w:space="0" w:color="FFFFFF"/>
-          <w:insideH w:val="none" w:sz="0" w:space="0" w:color="FFFFFF"/>
-          <w:insideV w:val="none" w:sz="0" w:space="0" w:color="FFFFFF"/>
+          <w:top w:val="none"/>
+          <w:left w:val="none"/>
+          <w:bottom w:val="none"/>
+          <w:right w:val="none"/>
+          <w:insideH w:val="none"/>
+          <w:insideV w:val="none"/>
         </w:tblBorders>
       </w:tblPr>
       <w:tblGrid>
-        <w:gridCol w:w="10080"/>
+        <w:gridCol w:w="10656"/>
       </w:tblGrid>
       <w:tr>
         <w:tc>
           <w:tcPr>
-            <w:tcW w:type="dxa" w:w="10080"/>
+            <w:tcW w:type="dxa" w:w="10656"/>
             <w:tcMar>
-              <w:top w:w="60" w:type="dxa"/>
-              <w:left w:w="120" w:type="dxa"/>
-              <w:bottom w:w="60" w:type="dxa"/>
-              <w:right w:w="120" w:type="dxa"/>
+              <w:top w:w="70" w:type="dxa"/>
+              <w:left w:w="110" w:type="dxa"/>
+              <w:bottom w:w="70" w:type="dxa"/>
+              <w:right w:w="110" w:type="dxa"/>
             </w:tcMar>
-            <w:shd w:fill="2F3C7E"/>
+            <w:shd w:val="clear" w:color="auto" w:fill="0F5A5C"/>
+            <w:vAlign w:val="center"/>
           </w:tcPr>
           <w:p>
             <w:r>
               <w:rPr>
-                <w:rFonts w:ascii="Calibri" w:hAnsi="Calibri" w:cs="Calibri"/>
-                <w:b/>
-                <w:i w:val="0"/>
-                <w:caps/>
-                <w:color w:val="E8C54A"/>
-                <w:sz w:val="26"/>
-              </w:rPr>
-              <w:t xml:space="preserve">BIG QUESTION   </w:t>
-            </w:r>
-            <w:r>
-              <w:rPr>
-                <w:rFonts w:ascii="Calibri" w:hAnsi="Calibri" w:cs="Calibri"/>
+                <w:rFonts w:ascii="Avenir Next" w:hAnsi="Avenir Next"/>
                 <w:b/>
                 <w:i w:val="0"/>
                 <w:color w:val="FFFFFF"/>
-                <w:sz w:val="30"/>
+                <w:sz w:val="32"/>
+                <w:u w:val="none"/>
+                <w:rFonts w:ascii="Avenir Next" w:hAnsi="Avenir Next" w:cs="Avenir Next"/>
               </w:rPr>
-              <w:t>How are energy, change, and movement of objects related?</w:t>
+              <w:t>BQ   How are energy, change, and movement of objects related?</w:t>
             </w:r>
           </w:p>
         </w:tc>
@@ -135,173 +243,29 @@
     </w:tbl>
     <w:p>
       <w:pPr>
-        <w:spacing w:after="80"/>
-      </w:pPr>
-    </w:p>
-    <w:p>
-      <w:pPr>
-        <w:spacing w:before="100" w:after="40"/>
+        <w:spacing w:before="0" w:after="80"/>
       </w:pPr>
       <w:r>
         <w:rPr>
-          <w:rFonts w:ascii="Calibri" w:hAnsi="Calibri" w:cs="Calibri"/>
-          <w:b/>
-          <w:i w:val="0"/>
-          <w:caps/>
-          <w:color w:val="2F3C7E"/>
-          <w:sz w:val="32"/>
+          <w:sz w:val="4"/>
         </w:rPr>
-        <w:t>Notice</w:t>
       </w:r>
     </w:p>
     <w:p>
       <w:pPr>
-        <w:spacing w:before="0" w:after="20"/>
+        <w:spacing w:before="0" w:after="80"/>
       </w:pPr>
       <w:r>
         <w:rPr>
-          <w:rFonts w:ascii="Calibri" w:hAnsi="Calibri" w:cs="Calibri"/>
-          <w:b w:val="0"/>
-          <w:i w:val="0"/>
-          <w:color w:val="555555"/>
-          <w:sz w:val="24"/>
-        </w:rPr>
-        <w:t>In our marble demo, write what happened when the moving marble reached the target.</w:t>
-      </w:r>
-    </w:p>
-    <w:p>
-      <w:pPr>
-        <w:spacing w:after="360" w:line="600" w:lineRule="exact"/>
-        <w:pBdr>
-          <w:bottom w:val="single" w:sz="8" w:space="4" w:color="1F1F1F"/>
-        </w:pBdr>
-      </w:pPr>
-    </w:p>
-    <w:p>
-      <w:pPr>
-        <w:spacing w:after="360" w:line="600" w:lineRule="exact"/>
-        <w:pBdr>
-          <w:bottom w:val="single" w:sz="8" w:space="4" w:color="1F1F1F"/>
-        </w:pBdr>
-      </w:pPr>
-    </w:p>
-    <w:p>
-      <w:pPr>
-        <w:spacing w:before="100" w:after="40"/>
-      </w:pPr>
-      <w:r>
-        <w:rPr>
-          <w:rFonts w:ascii="Calibri" w:hAnsi="Calibri" w:cs="Calibri"/>
+          <w:rFonts w:ascii="Avenir Next" w:hAnsi="Avenir Next"/>
           <w:b/>
           <w:i w:val="0"/>
-          <w:caps/>
-          <w:color w:val="2F3C7E"/>
-          <w:sz w:val="32"/>
+          <w:color w:val="0F5A5C"/>
+          <w:sz w:val="29"/>
+          <w:u w:val="none"/>
+          <w:rFonts w:ascii="Avenir Next" w:hAnsi="Avenir Next" w:cs="Avenir Next"/>
         </w:rPr>
-        <w:t>Key Words</w:t>
-      </w:r>
-    </w:p>
-    <w:p>
-      <w:pPr>
-        <w:spacing w:after="60"/>
-      </w:pPr>
-      <w:r>
-        <w:rPr>
-          <w:rFonts w:ascii="Calibri" w:hAnsi="Calibri" w:cs="Calibri"/>
-          <w:b w:val="0"/>
-          <w:i w:val="0"/>
-          <w:color w:val="1F1F1F"/>
-          <w:sz w:val="26"/>
-        </w:rPr>
-        <w:t xml:space="preserve">motion — Motion is the process of an object changing </w:t>
-      </w:r>
-      <w:r>
-        <w:rPr>
-          <w:rFonts w:ascii="Calibri" w:hAnsi="Calibri" w:cs="Calibri"/>
-          <w:b w:val="0"/>
-          <w:i w:val="0"/>
-          <w:color w:val="1F1F1F"/>
-          <w:sz w:val="26"/>
-          <w:u w:val="single"/>
-        </w:rPr>
-        <w:t>________________________</w:t>
-      </w:r>
-      <w:r>
-        <w:rPr>
-          <w:rFonts w:ascii="Calibri" w:hAnsi="Calibri" w:cs="Calibri"/>
-          <w:b w:val="0"/>
-          <w:i w:val="0"/>
-          <w:color w:val="1F1F1F"/>
-          <w:sz w:val="26"/>
-        </w:rPr>
-        <w:t xml:space="preserve"> .</w:t>
-      </w:r>
-    </w:p>
-    <w:p>
-      <w:pPr>
-        <w:spacing w:after="60"/>
-      </w:pPr>
-      <w:r>
-        <w:rPr>
-          <w:rFonts w:ascii="Calibri" w:hAnsi="Calibri" w:cs="Calibri"/>
-          <w:b w:val="0"/>
-          <w:i w:val="0"/>
-          <w:color w:val="1F1F1F"/>
-          <w:sz w:val="26"/>
-        </w:rPr>
-        <w:t xml:space="preserve">energy of motion — Energy of motion is the energy an object has </w:t>
-      </w:r>
-      <w:r>
-        <w:rPr>
-          <w:rFonts w:ascii="Calibri" w:hAnsi="Calibri" w:cs="Calibri"/>
-          <w:b w:val="0"/>
-          <w:i w:val="0"/>
-          <w:color w:val="1F1F1F"/>
-          <w:sz w:val="26"/>
-          <w:u w:val="single"/>
-        </w:rPr>
-        <w:t>________________</w:t>
-      </w:r>
-      <w:r>
-        <w:rPr>
-          <w:rFonts w:ascii="Calibri" w:hAnsi="Calibri" w:cs="Calibri"/>
-          <w:b w:val="0"/>
-          <w:i w:val="0"/>
-          <w:color w:val="1F1F1F"/>
-          <w:sz w:val="26"/>
-        </w:rPr>
-        <w:t xml:space="preserve"> it is moving.</w:t>
-      </w:r>
-    </w:p>
-    <w:p>
-      <w:pPr>
-        <w:spacing w:before="100" w:after="40"/>
-      </w:pPr>
-      <w:r>
-        <w:rPr>
-          <w:rFonts w:ascii="Calibri" w:hAnsi="Calibri" w:cs="Calibri"/>
-          <w:b/>
-          <w:i w:val="0"/>
-          <w:caps/>
-          <w:color w:val="2F3C7E"/>
-          <w:sz w:val="32"/>
-        </w:rPr>
-        <w:t>Model It</w:t>
-      </w:r>
-    </w:p>
-    <w:p>
-      <w:pPr>
-        <w:spacing w:before="0" w:after="30"/>
-      </w:pPr>
-      <w:r>
-        <w:rPr>
-          <w:rFonts w:ascii="Calibri" w:hAnsi="Calibri" w:cs="Calibri"/>
-          <w:b w:val="0"/>
-          <w:i/>
-          <w:color w:val="555555"/>
-          <w:sz w:val="24"/>
-        </w:rPr>
-        <w:t>A moving object can cause another object to change. The change is our evidence.</w:t>
+        <w:t>My first thinking</w:t>
       </w:r>
     </w:p>
     <w:tbl>
@@ -309,33 +273,684 @@
         <w:tblW w:type="auto" w:w="0"/>
         <w:tblLook w:firstColumn="1" w:firstRow="1" w:lastColumn="0" w:lastRow="0" w:noHBand="0" w:noVBand="1" w:val="04A0"/>
         <w:tblBorders>
-          <w:top w:val="none" w:sz="0" w:space="0" w:color="FFFFFF"/>
-          <w:left w:val="none" w:sz="0" w:space="0" w:color="FFFFFF"/>
-          <w:bottom w:val="none" w:sz="0" w:space="0" w:color="FFFFFF"/>
-          <w:right w:val="none" w:sz="0" w:space="0" w:color="FFFFFF"/>
-          <w:insideH w:val="none" w:sz="0" w:space="0" w:color="FFFFFF"/>
-          <w:insideV w:val="none" w:sz="0" w:space="0" w:color="FFFFFF"/>
+          <w:top w:val="none"/>
+          <w:left w:val="none"/>
+          <w:bottom w:val="none"/>
+          <w:right w:val="none"/>
+          <w:insideH w:val="none"/>
+          <w:insideV w:val="none"/>
         </w:tblBorders>
       </w:tblPr>
       <w:tblGrid>
-        <w:gridCol w:w="2016"/>
-        <w:gridCol w:w="2016"/>
-        <w:gridCol w:w="2016"/>
-        <w:gridCol w:w="2016"/>
-        <w:gridCol w:w="2016"/>
+        <w:gridCol w:w="10656"/>
+      </w:tblGrid>
+      <w:tr>
+        <w:trPr>
+          <w:trHeight w:val="560" w:hRule="exact"/>
+        </w:trPr>
+        <w:tc>
+          <w:tcPr>
+            <w:tcW w:type="dxa" w:w="10656"/>
+            <w:tcMar>
+              <w:top w:w="0" w:type="dxa"/>
+              <w:left w:w="0" w:type="dxa"/>
+              <w:bottom w:w="0" w:type="dxa"/>
+              <w:right w:w="0" w:type="dxa"/>
+            </w:tcMar>
+            <w:tcBorders>
+              <w:bottom w:val="single" w:sz="8" w:color="1A1D26"/>
+            </w:tcBorders>
+          </w:tcPr>
+          <w:p>
+            <w:pPr>
+              <w:spacing w:before="0" w:after="0" w:line="40" w:lineRule="exact"/>
+            </w:pPr>
+            <w:r>
+              <w:rPr>
+                <w:rFonts w:ascii="Avenir Next" w:hAnsi="Avenir Next"/>
+                <w:b w:val="0"/>
+                <w:i w:val="0"/>
+                <w:color w:val="1A1D26"/>
+                <w:sz w:val="4"/>
+                <w:u w:val="none"/>
+                <w:rFonts w:ascii="Avenir Next" w:hAnsi="Avenir Next" w:cs="Avenir Next"/>
+              </w:rPr>
+            </w:r>
+          </w:p>
+        </w:tc>
+      </w:tr>
+      <w:tr>
+        <w:trPr>
+          <w:trHeight w:val="560" w:hRule="exact"/>
+        </w:trPr>
+        <w:tc>
+          <w:tcPr>
+            <w:tcW w:type="dxa" w:w="10656"/>
+            <w:tcMar>
+              <w:top w:w="0" w:type="dxa"/>
+              <w:left w:w="0" w:type="dxa"/>
+              <w:bottom w:w="0" w:type="dxa"/>
+              <w:right w:w="0" w:type="dxa"/>
+            </w:tcMar>
+            <w:tcBorders>
+              <w:bottom w:val="single" w:sz="8" w:color="1A1D26"/>
+            </w:tcBorders>
+          </w:tcPr>
+          <w:p>
+            <w:pPr>
+              <w:spacing w:before="0" w:after="0" w:line="40" w:lineRule="exact"/>
+            </w:pPr>
+            <w:r>
+              <w:rPr>
+                <w:rFonts w:ascii="Avenir Next" w:hAnsi="Avenir Next"/>
+                <w:b w:val="0"/>
+                <w:i w:val="0"/>
+                <w:color w:val="1A1D26"/>
+                <w:sz w:val="4"/>
+                <w:u w:val="none"/>
+                <w:rFonts w:ascii="Avenir Next" w:hAnsi="Avenir Next" w:cs="Avenir Next"/>
+              </w:rPr>
+            </w:r>
+          </w:p>
+        </w:tc>
+      </w:tr>
+    </w:tbl>
+    <w:tbl>
+      <w:tblPr>
+        <w:tblW w:type="auto" w:w="0"/>
+        <w:tblLook w:firstColumn="1" w:firstRow="1" w:lastColumn="0" w:lastRow="0" w:noHBand="0" w:noVBand="1" w:val="04A0"/>
+        <w:tblBorders>
+          <w:top w:val="none"/>
+          <w:left w:val="none"/>
+          <w:bottom w:val="none"/>
+          <w:right w:val="none"/>
+          <w:insideH w:val="none"/>
+          <w:insideV w:val="none"/>
+        </w:tblBorders>
+      </w:tblPr>
+      <w:tblGrid>
+        <w:gridCol w:w="10656"/>
       </w:tblGrid>
       <w:tr>
         <w:tc>
           <w:tcPr>
-            <w:tcW w:type="dxa" w:w="2060"/>
+            <w:tcW w:type="dxa" w:w="10656"/>
+            <w:tcMar>
+              <w:top w:w="12" w:type="dxa"/>
+              <w:left w:w="0" w:type="dxa"/>
+              <w:bottom w:w="18" w:type="dxa"/>
+              <w:right w:w="0" w:type="dxa"/>
+            </w:tcMar>
+          </w:tcPr>
+          <w:p>
+            <w:pPr>
+              <w:pBdr>
+                <w:bottom w:val="single" w:sz="10" w:color="0F5A5C"/>
+              </w:pBdr>
+            </w:pPr>
+            <w:r>
+              <w:rPr>
+                <w:rFonts w:ascii="Avenir Next" w:hAnsi="Avenir Next"/>
+                <w:b/>
+                <w:i w:val="0"/>
+                <w:color w:val="0E8A97"/>
+                <w:sz w:val="32"/>
+                <w:u w:val="none"/>
+                <w:rFonts w:ascii="Avenir Next" w:hAnsi="Avenir Next" w:cs="Avenir Next"/>
+              </w:rPr>
+              <w:t xml:space="preserve">V1   </w:t>
+            </w:r>
+            <w:r>
+              <w:rPr>
+                <w:rFonts w:ascii="Avenir Next" w:hAnsi="Avenir Next"/>
+                <w:b/>
+                <w:i w:val="0"/>
+                <w:color w:val="0F5A5C"/>
+                <w:sz w:val="32"/>
+                <w:u w:val="none"/>
+                <w:rFonts w:ascii="Avenir Next" w:hAnsi="Avenir Next" w:cs="Avenir Next"/>
+              </w:rPr>
+              <w:t>VOCABULARY — MOTION</w:t>
+            </w:r>
+          </w:p>
+        </w:tc>
+      </w:tr>
+    </w:tbl>
+    <w:p>
+      <w:pPr>
+        <w:spacing w:before="0" w:after="80"/>
+      </w:pPr>
+      <w:r>
+        <w:rPr>
+          <w:rFonts w:ascii="Avenir Next" w:hAnsi="Avenir Next"/>
+          <w:b w:val="0"/>
+          <w:i/>
+          <w:color w:val="4A5268"/>
+          <w:sz w:val="19"/>
+          <w:u w:val="none"/>
+          <w:rFonts w:ascii="Avenir Next" w:hAnsi="Avenir Next" w:cs="Avenir Next"/>
+        </w:rPr>
+        <w:t>Reader p. 7</w:t>
+      </w:r>
+    </w:p>
+    <w:p>
+      <w:pPr>
+        <w:spacing w:before="0" w:after="80" w:line="520" w:lineRule="exact"/>
+      </w:pPr>
+      <w:r>
+        <w:rPr>
+          <w:rFonts w:ascii="Avenir Next" w:hAnsi="Avenir Next"/>
+          <w:b w:val="0"/>
+          <w:i w:val="0"/>
+          <w:color w:val="1A1D26"/>
+          <w:sz w:val="28"/>
+          <w:u w:val="none"/>
+          <w:rFonts w:ascii="Avenir Next" w:hAnsi="Avenir Next" w:cs="Avenir Next"/>
+        </w:rPr>
+        <w:t xml:space="preserve">motion — the process of an object changing </w:t>
+      </w:r>
+      <w:r>
+        <w:rPr>
+          <w:rFonts w:ascii="Avenir Next" w:hAnsi="Avenir Next"/>
+          <w:b w:val="0"/>
+          <w:i w:val="0"/>
+          <w:color w:val="1A1D26"/>
+          <w:sz w:val="28"/>
+          <w:u w:val="single"/>
+          <w:rFonts w:ascii="Avenir Next" w:hAnsi="Avenir Next" w:cs="Avenir Next"/>
+        </w:rPr>
+        <w:t>______________</w:t>
+      </w:r>
+      <w:r>
+        <w:rPr>
+          <w:rFonts w:ascii="Avenir Next" w:hAnsi="Avenir Next"/>
+          <w:b w:val="0"/>
+          <w:i w:val="0"/>
+          <w:color w:val="1A1D26"/>
+          <w:sz w:val="28"/>
+          <w:u w:val="none"/>
+          <w:rFonts w:ascii="Avenir Next" w:hAnsi="Avenir Next" w:cs="Avenir Next"/>
+        </w:rPr>
+        <w:t xml:space="preserve"> .</w:t>
+      </w:r>
+    </w:p>
+    <w:tbl>
+      <w:tblPr>
+        <w:tblW w:type="auto" w:w="0"/>
+        <w:tblLook w:firstColumn="1" w:firstRow="1" w:lastColumn="0" w:lastRow="0" w:noHBand="0" w:noVBand="1" w:val="04A0"/>
+        <w:tblBorders>
+          <w:top w:val="none"/>
+          <w:left w:val="none"/>
+          <w:bottom w:val="none"/>
+          <w:right w:val="none"/>
+          <w:insideH w:val="none"/>
+          <w:insideV w:val="none"/>
+        </w:tblBorders>
+      </w:tblPr>
+      <w:tblGrid>
+        <w:gridCol w:w="10656"/>
+      </w:tblGrid>
+      <w:tr>
+        <w:tc>
+          <w:tcPr>
+            <w:tcW w:type="dxa" w:w="10656"/>
+            <w:tcMar>
+              <w:top w:w="12" w:type="dxa"/>
+              <w:left w:w="0" w:type="dxa"/>
+              <w:bottom w:w="18" w:type="dxa"/>
+              <w:right w:w="0" w:type="dxa"/>
+            </w:tcMar>
+          </w:tcPr>
+          <w:p>
+            <w:pPr>
+              <w:pBdr>
+                <w:bottom w:val="single" w:sz="10" w:color="0F5A5C"/>
+              </w:pBdr>
+            </w:pPr>
+            <w:r>
+              <w:rPr>
+                <w:rFonts w:ascii="Avenir Next" w:hAnsi="Avenir Next"/>
+                <w:b/>
+                <w:i w:val="0"/>
+                <w:color w:val="0E8A97"/>
+                <w:sz w:val="32"/>
+                <w:u w:val="none"/>
+                <w:rFonts w:ascii="Avenir Next" w:hAnsi="Avenir Next" w:cs="Avenir Next"/>
+              </w:rPr>
+              <w:t xml:space="preserve">N1   </w:t>
+            </w:r>
+            <w:r>
+              <w:rPr>
+                <w:rFonts w:ascii="Avenir Next" w:hAnsi="Avenir Next"/>
+                <w:b/>
+                <w:i w:val="0"/>
+                <w:color w:val="0F5A5C"/>
+                <w:sz w:val="32"/>
+                <w:u w:val="none"/>
+                <w:rFonts w:ascii="Avenir Next" w:hAnsi="Avenir Next" w:cs="Avenir Next"/>
+              </w:rPr>
+              <w:t>MOVING OBJECTS CAN CAUSE CHANGES</w:t>
+            </w:r>
+          </w:p>
+        </w:tc>
+      </w:tr>
+    </w:tbl>
+    <w:p>
+      <w:pPr>
+        <w:spacing w:before="0" w:after="80"/>
+      </w:pPr>
+      <w:r>
+        <w:rPr>
+          <w:rFonts w:ascii="Avenir Next" w:hAnsi="Avenir Next"/>
+          <w:b w:val="0"/>
+          <w:i/>
+          <w:color w:val="4A5268"/>
+          <w:sz w:val="19"/>
+          <w:u w:val="none"/>
+          <w:rFonts w:ascii="Avenir Next" w:hAnsi="Avenir Next" w:cs="Avenir Next"/>
+        </w:rPr>
+        <w:t>Reader p. 8</w:t>
+      </w:r>
+    </w:p>
+    <w:p>
+      <w:pPr>
+        <w:spacing w:before="0" w:after="80" w:line="520" w:lineRule="exact"/>
+      </w:pPr>
+      <w:r>
+        <w:rPr>
+          <w:rFonts w:ascii="Avenir Next" w:hAnsi="Avenir Next"/>
+          <w:b/>
+          <w:i w:val="0"/>
+          <w:color w:val="1A1D26"/>
+          <w:sz w:val="28"/>
+          <w:u w:val="none"/>
+          <w:rFonts w:ascii="Avenir Next" w:hAnsi="Avenir Next" w:cs="Avenir Next"/>
+        </w:rPr>
+        <w:t xml:space="preserve">A moving object can cause a </w:t>
+      </w:r>
+      <w:r>
+        <w:rPr>
+          <w:rFonts w:ascii="Avenir Next" w:hAnsi="Avenir Next"/>
+          <w:b w:val="0"/>
+          <w:i w:val="0"/>
+          <w:color w:val="1A1D26"/>
+          <w:sz w:val="28"/>
+          <w:u w:val="single"/>
+          <w:rFonts w:ascii="Avenir Next" w:hAnsi="Avenir Next" w:cs="Avenir Next"/>
+        </w:rPr>
+        <w:t>______________</w:t>
+      </w:r>
+      <w:r>
+        <w:rPr>
+          <w:rFonts w:ascii="Avenir Next" w:hAnsi="Avenir Next"/>
+          <w:b w:val="0"/>
+          <w:i w:val="0"/>
+          <w:color w:val="1A1D26"/>
+          <w:sz w:val="28"/>
+          <w:u w:val="none"/>
+          <w:rFonts w:ascii="Avenir Next" w:hAnsi="Avenir Next" w:cs="Avenir Next"/>
+        </w:rPr>
+        <w:t xml:space="preserve"> .</w:t>
+      </w:r>
+    </w:p>
+    <w:p>
+      <w:pPr>
+        <w:spacing w:before="0" w:after="120"/>
+      </w:pPr>
+      <w:r>
+        <w:rPr>
+          <w:rFonts w:ascii="Avenir Next" w:hAnsi="Avenir Next"/>
+          <w:b w:val="0"/>
+          <w:i/>
+          <w:color w:val="4A5268"/>
+          <w:sz w:val="24"/>
+          <w:u w:val="none"/>
+          <w:rFonts w:ascii="Avenir Next" w:hAnsi="Avenir Next" w:cs="Avenir Next"/>
+        </w:rPr>
+        <w:t>Players cause their own motion. A ball does not. Something else puts the ball into motion.</w:t>
+      </w:r>
+    </w:p>
+    <w:p>
+      <w:pPr>
+        <w:spacing w:before="0" w:after="80" w:line="520" w:lineRule="exact"/>
+      </w:pPr>
+      <w:r>
+        <w:rPr>
+          <w:rFonts w:ascii="Avenir Next" w:hAnsi="Avenir Next"/>
+          <w:b w:val="0"/>
+          <w:i w:val="0"/>
+          <w:color w:val="1A1D26"/>
+          <w:sz w:val="28"/>
+          <w:u w:val="none"/>
+          <w:rFonts w:ascii="Avenir Next" w:hAnsi="Avenir Next" w:cs="Avenir Next"/>
+        </w:rPr>
+        <w:t xml:space="preserve">Some objects cause their own motion. Other objects are put into motion by </w:t>
+      </w:r>
+      <w:r>
+        <w:rPr>
+          <w:rFonts w:ascii="Avenir Next" w:hAnsi="Avenir Next"/>
+          <w:b w:val="0"/>
+          <w:i w:val="0"/>
+          <w:color w:val="1A1D26"/>
+          <w:sz w:val="28"/>
+          <w:u w:val="single"/>
+          <w:rFonts w:ascii="Avenir Next" w:hAnsi="Avenir Next" w:cs="Avenir Next"/>
+        </w:rPr>
+        <w:t>____________</w:t>
+      </w:r>
+      <w:r>
+        <w:rPr>
+          <w:rFonts w:ascii="Avenir Next" w:hAnsi="Avenir Next"/>
+          <w:b w:val="0"/>
+          <w:i w:val="0"/>
+          <w:color w:val="1A1D26"/>
+          <w:sz w:val="28"/>
+          <w:u w:val="none"/>
+          <w:rFonts w:ascii="Avenir Next" w:hAnsi="Avenir Next" w:cs="Avenir Next"/>
+        </w:rPr>
+        <w:t xml:space="preserve"> motion.</w:t>
+      </w:r>
+    </w:p>
+    <w:p>
+      <w:r>
+        <w:br w:type="page"/>
+      </w:r>
+    </w:p>
+    <w:tbl>
+      <w:tblPr>
+        <w:tblW w:type="auto" w:w="0"/>
+        <w:tblLook w:firstColumn="1" w:firstRow="1" w:lastColumn="0" w:lastRow="0" w:noHBand="0" w:noVBand="1" w:val="04A0"/>
+        <w:tblBorders>
+          <w:top w:val="none"/>
+          <w:left w:val="none"/>
+          <w:bottom w:val="none"/>
+          <w:right w:val="none"/>
+          <w:insideH w:val="none"/>
+          <w:insideV w:val="none"/>
+        </w:tblBorders>
+      </w:tblPr>
+      <w:tblGrid>
+        <w:gridCol w:w="10656"/>
+      </w:tblGrid>
+      <w:tr>
+        <w:tc>
+          <w:tcPr>
+            <w:tcW w:type="dxa" w:w="10656"/>
+            <w:tcMar>
+              <w:top w:w="12" w:type="dxa"/>
+              <w:left w:w="0" w:type="dxa"/>
+              <w:bottom w:w="18" w:type="dxa"/>
+              <w:right w:w="0" w:type="dxa"/>
+            </w:tcMar>
+          </w:tcPr>
+          <w:p>
+            <w:pPr>
+              <w:pBdr>
+                <w:bottom w:val="single" w:sz="10" w:color="0F5A5C"/>
+              </w:pBdr>
+            </w:pPr>
+            <w:r>
+              <w:rPr>
+                <w:rFonts w:ascii="Avenir Next" w:hAnsi="Avenir Next"/>
+                <w:b/>
+                <w:i w:val="0"/>
+                <w:color w:val="0E8A97"/>
+                <w:sz w:val="32"/>
+                <w:u w:val="none"/>
+                <w:rFonts w:ascii="Avenir Next" w:hAnsi="Avenir Next" w:cs="Avenir Next"/>
+              </w:rPr>
+              <w:t xml:space="preserve">V2   </w:t>
+            </w:r>
+            <w:r>
+              <w:rPr>
+                <w:rFonts w:ascii="Avenir Next" w:hAnsi="Avenir Next"/>
+                <w:b/>
+                <w:i w:val="0"/>
+                <w:color w:val="0F5A5C"/>
+                <w:sz w:val="32"/>
+                <w:u w:val="none"/>
+                <w:rFonts w:ascii="Avenir Next" w:hAnsi="Avenir Next" w:cs="Avenir Next"/>
+              </w:rPr>
+              <w:t>VOCABULARY — ENERGY OF MOTION</w:t>
+            </w:r>
+          </w:p>
+        </w:tc>
+      </w:tr>
+    </w:tbl>
+    <w:p>
+      <w:pPr>
+        <w:spacing w:before="0" w:after="80"/>
+      </w:pPr>
+      <w:r>
+        <w:rPr>
+          <w:rFonts w:ascii="Avenir Next" w:hAnsi="Avenir Next"/>
+          <w:b w:val="0"/>
+          <w:i/>
+          <w:color w:val="4A5268"/>
+          <w:sz w:val="19"/>
+          <w:u w:val="none"/>
+          <w:rFonts w:ascii="Avenir Next" w:hAnsi="Avenir Next" w:cs="Avenir Next"/>
+        </w:rPr>
+        <w:t>Reader p. 9</w:t>
+      </w:r>
+    </w:p>
+    <w:p>
+      <w:pPr>
+        <w:spacing w:before="0" w:after="80" w:line="520" w:lineRule="exact"/>
+      </w:pPr>
+      <w:r>
+        <w:rPr>
+          <w:rFonts w:ascii="Avenir Next" w:hAnsi="Avenir Next"/>
+          <w:b w:val="0"/>
+          <w:i w:val="0"/>
+          <w:color w:val="1A1D26"/>
+          <w:sz w:val="28"/>
+          <w:u w:val="none"/>
+          <w:rFonts w:ascii="Avenir Next" w:hAnsi="Avenir Next" w:cs="Avenir Next"/>
+        </w:rPr>
+        <w:t xml:space="preserve">energy of motion — the energy an object possesses while it is </w:t>
+      </w:r>
+      <w:r>
+        <w:rPr>
+          <w:rFonts w:ascii="Avenir Next" w:hAnsi="Avenir Next"/>
+          <w:b w:val="0"/>
+          <w:i w:val="0"/>
+          <w:color w:val="1A1D26"/>
+          <w:sz w:val="28"/>
+          <w:u w:val="single"/>
+          <w:rFonts w:ascii="Avenir Next" w:hAnsi="Avenir Next" w:cs="Avenir Next"/>
+        </w:rPr>
+        <w:t>______________</w:t>
+      </w:r>
+      <w:r>
+        <w:rPr>
+          <w:rFonts w:ascii="Avenir Next" w:hAnsi="Avenir Next"/>
+          <w:b w:val="0"/>
+          <w:i w:val="0"/>
+          <w:color w:val="1A1D26"/>
+          <w:sz w:val="28"/>
+          <w:u w:val="none"/>
+          <w:rFonts w:ascii="Avenir Next" w:hAnsi="Avenir Next" w:cs="Avenir Next"/>
+        </w:rPr>
+        <w:t xml:space="preserve"> .</w:t>
+      </w:r>
+    </w:p>
+    <w:tbl>
+      <w:tblPr>
+        <w:tblW w:type="auto" w:w="0"/>
+        <w:tblLook w:firstColumn="1" w:firstRow="1" w:lastColumn="0" w:lastRow="0" w:noHBand="0" w:noVBand="1" w:val="04A0"/>
+        <w:tblBorders>
+          <w:top w:val="none"/>
+          <w:left w:val="none"/>
+          <w:bottom w:val="none"/>
+          <w:right w:val="none"/>
+          <w:insideH w:val="none"/>
+          <w:insideV w:val="none"/>
+        </w:tblBorders>
+      </w:tblPr>
+      <w:tblGrid>
+        <w:gridCol w:w="10656"/>
+      </w:tblGrid>
+      <w:tr>
+        <w:tc>
+          <w:tcPr>
+            <w:tcW w:type="dxa" w:w="10656"/>
+            <w:tcMar>
+              <w:top w:w="12" w:type="dxa"/>
+              <w:left w:w="0" w:type="dxa"/>
+              <w:bottom w:w="18" w:type="dxa"/>
+              <w:right w:w="0" w:type="dxa"/>
+            </w:tcMar>
+          </w:tcPr>
+          <w:p>
+            <w:pPr>
+              <w:pBdr>
+                <w:bottom w:val="single" w:sz="10" w:color="0F5A5C"/>
+              </w:pBdr>
+            </w:pPr>
+            <w:r>
+              <w:rPr>
+                <w:rFonts w:ascii="Avenir Next" w:hAnsi="Avenir Next"/>
+                <w:b/>
+                <w:i w:val="0"/>
+                <w:color w:val="0E8A97"/>
+                <w:sz w:val="32"/>
+                <w:u w:val="none"/>
+                <w:rFonts w:ascii="Avenir Next" w:hAnsi="Avenir Next" w:cs="Avenir Next"/>
+              </w:rPr>
+              <w:t xml:space="preserve">N2   </w:t>
+            </w:r>
+            <w:r>
+              <w:rPr>
+                <w:rFonts w:ascii="Avenir Next" w:hAnsi="Avenir Next"/>
+                <w:b/>
+                <w:i w:val="0"/>
+                <w:color w:val="0F5A5C"/>
+                <w:sz w:val="32"/>
+                <w:u w:val="none"/>
+                <w:rFonts w:ascii="Avenir Next" w:hAnsi="Avenir Next" w:cs="Avenir Next"/>
+              </w:rPr>
+              <w:t>MOVING OBJECTS HAVE ENERGY</w:t>
+            </w:r>
+          </w:p>
+        </w:tc>
+      </w:tr>
+    </w:tbl>
+    <w:p>
+      <w:pPr>
+        <w:spacing w:before="0" w:after="80"/>
+      </w:pPr>
+      <w:r>
+        <w:rPr>
+          <w:rFonts w:ascii="Avenir Next" w:hAnsi="Avenir Next"/>
+          <w:b w:val="0"/>
+          <w:i/>
+          <w:color w:val="4A5268"/>
+          <w:sz w:val="19"/>
+          <w:u w:val="none"/>
+          <w:rFonts w:ascii="Avenir Next" w:hAnsi="Avenir Next" w:cs="Avenir Next"/>
+        </w:rPr>
+        <w:t>Reader p. 9</w:t>
+      </w:r>
+    </w:p>
+    <w:p>
+      <w:pPr>
+        <w:spacing w:before="0" w:after="80" w:line="520" w:lineRule="exact"/>
+      </w:pPr>
+      <w:r>
+        <w:rPr>
+          <w:rFonts w:ascii="Avenir Next" w:hAnsi="Avenir Next"/>
+          <w:b/>
+          <w:i w:val="0"/>
+          <w:color w:val="1A1D26"/>
+          <w:sz w:val="28"/>
+          <w:u w:val="none"/>
+          <w:rFonts w:ascii="Avenir Next" w:hAnsi="Avenir Next" w:cs="Avenir Next"/>
+        </w:rPr>
+        <w:t xml:space="preserve">All moving objects have energy of </w:t>
+      </w:r>
+      <w:r>
+        <w:rPr>
+          <w:rFonts w:ascii="Avenir Next" w:hAnsi="Avenir Next"/>
+          <w:b w:val="0"/>
+          <w:i w:val="0"/>
+          <w:color w:val="1A1D26"/>
+          <w:sz w:val="28"/>
+          <w:u w:val="single"/>
+          <w:rFonts w:ascii="Avenir Next" w:hAnsi="Avenir Next" w:cs="Avenir Next"/>
+        </w:rPr>
+        <w:t>______________</w:t>
+      </w:r>
+      <w:r>
+        <w:rPr>
+          <w:rFonts w:ascii="Avenir Next" w:hAnsi="Avenir Next"/>
+          <w:b w:val="0"/>
+          <w:i w:val="0"/>
+          <w:color w:val="1A1D26"/>
+          <w:sz w:val="28"/>
+          <w:u w:val="none"/>
+          <w:rFonts w:ascii="Avenir Next" w:hAnsi="Avenir Next" w:cs="Avenir Next"/>
+        </w:rPr>
+        <w:t xml:space="preserve"> .</w:t>
+      </w:r>
+    </w:p>
+    <w:p>
+      <w:pPr>
+        <w:spacing w:before="0" w:after="120"/>
+      </w:pPr>
+      <w:r>
+        <w:rPr>
+          <w:rFonts w:ascii="Avenir Next" w:hAnsi="Avenir Next"/>
+          <w:b w:val="0"/>
+          <w:i/>
+          <w:color w:val="4A5268"/>
+          <w:sz w:val="24"/>
+          <w:u w:val="none"/>
+          <w:rFonts w:ascii="Avenir Next" w:hAnsi="Avenir Next" w:cs="Avenir Next"/>
+        </w:rPr>
+        <w:t>Energy is the ability to cause change. A moving object causes change, so it has energy.</w:t>
+      </w:r>
+    </w:p>
+    <w:tbl>
+      <w:tblPr>
+        <w:tblW w:type="auto" w:w="0"/>
+        <w:tblLook w:firstColumn="1" w:firstRow="1" w:lastColumn="0" w:lastRow="0" w:noHBand="0" w:noVBand="1" w:val="04A0"/>
+        <w:jc w:val="center"/>
+        <w:tblBorders>
+          <w:top w:val="none"/>
+          <w:left w:val="none"/>
+          <w:bottom w:val="none"/>
+          <w:right w:val="none"/>
+          <w:insideH w:val="none"/>
+          <w:insideV w:val="none"/>
+        </w:tblBorders>
+      </w:tblPr>
+      <w:tblGrid>
+        <w:gridCol w:w="2131"/>
+        <w:gridCol w:w="2131"/>
+        <w:gridCol w:w="2131"/>
+        <w:gridCol w:w="2131"/>
+        <w:gridCol w:w="2131"/>
+      </w:tblGrid>
+      <w:tr>
+        <w:trPr>
+          <w:trHeight w:val="500" w:hRule="exact"/>
+          <w:trHeight w:val="500" w:hRule="exact"/>
+          <w:trHeight w:val="500" w:hRule="exact"/>
+          <w:trHeight w:val="500" w:hRule="exact"/>
+          <w:trHeight w:val="500" w:hRule="exact"/>
+        </w:trPr>
+        <w:tc>
+          <w:tcPr>
+            <w:tcW w:type="dxa" w:w="3024"/>
             <w:tcMar>
               <w:top w:w="40" w:type="dxa"/>
-              <w:left w:w="8" w:type="dxa"/>
+              <w:left w:w="6" w:type="dxa"/>
               <w:bottom w:w="40" w:type="dxa"/>
-              <w:right w:w="8" w:type="dxa"/>
+              <w:right w:w="6" w:type="dxa"/>
             </w:tcMar>
             <w:vAlign w:val="center"/>
-            <w:shd w:fill="2F3C7E"/>
+            <w:shd w:val="clear" w:color="auto" w:fill="0F5A5C"/>
           </w:tcPr>
           <w:p>
             <w:pPr>
@@ -343,11 +958,13 @@
             </w:pPr>
             <w:r>
               <w:rPr>
-                <w:rFonts w:ascii="Calibri" w:hAnsi="Calibri" w:cs="Calibri"/>
+                <w:rFonts w:ascii="Avenir Next" w:hAnsi="Avenir Next"/>
                 <w:b/>
                 <w:i w:val="0"/>
                 <w:color w:val="FFFFFF"/>
                 <w:sz w:val="24"/>
+                <w:u w:val="none"/>
+                <w:rFonts w:ascii="Avenir Next" w:hAnsi="Avenir Next" w:cs="Avenir Next"/>
               </w:rPr>
               <w:t>MOVING OBJECT</w:t>
             </w:r>
@@ -355,12 +972,12 @@
         </w:tc>
         <w:tc>
           <w:tcPr>
-            <w:tcW w:type="dxa" w:w="560"/>
+            <w:tcW w:type="dxa" w:w="720"/>
             <w:tcMar>
               <w:top w:w="40" w:type="dxa"/>
-              <w:left w:w="8" w:type="dxa"/>
+              <w:left w:w="6" w:type="dxa"/>
               <w:bottom w:w="40" w:type="dxa"/>
-              <w:right w:w="8" w:type="dxa"/>
+              <w:right w:w="6" w:type="dxa"/>
             </w:tcMar>
             <w:vAlign w:val="center"/>
           </w:tcPr>
@@ -370,11 +987,13 @@
             </w:pPr>
             <w:r>
               <w:rPr>
-                <w:rFonts w:ascii="Calibri" w:hAnsi="Calibri" w:cs="Calibri"/>
+                <w:rFonts w:ascii="Avenir Next" w:hAnsi="Avenir Next"/>
                 <w:b/>
                 <w:i w:val="0"/>
-                <w:color w:val="C03D3D"/>
+                <w:color w:val="0E8A97"/>
                 <w:sz w:val="28"/>
+                <w:u w:val="none"/>
+                <w:rFonts w:ascii="Avenir Next" w:hAnsi="Avenir Next" w:cs="Avenir Next"/>
               </w:rPr>
               <w:t>→</w:t>
             </w:r>
@@ -382,15 +1001,15 @@
         </w:tc>
         <w:tc>
           <w:tcPr>
-            <w:tcW w:type="dxa" w:w="2060"/>
+            <w:tcW w:type="dxa" w:w="3024"/>
             <w:tcMar>
               <w:top w:w="40" w:type="dxa"/>
-              <w:left w:w="8" w:type="dxa"/>
+              <w:left w:w="6" w:type="dxa"/>
               <w:bottom w:w="40" w:type="dxa"/>
-              <w:right w:w="8" w:type="dxa"/>
+              <w:right w:w="6" w:type="dxa"/>
             </w:tcMar>
             <w:vAlign w:val="center"/>
-            <w:shd w:fill="2F3C7E"/>
+            <w:shd w:val="clear" w:color="auto" w:fill="0F5A5C"/>
           </w:tcPr>
           <w:p>
             <w:pPr>
@@ -398,24 +1017,26 @@
             </w:pPr>
             <w:r>
               <w:rPr>
-                <w:rFonts w:ascii="Calibri" w:hAnsi="Calibri" w:cs="Calibri"/>
+                <w:rFonts w:ascii="Avenir Next" w:hAnsi="Avenir Next"/>
                 <w:b/>
                 <w:i w:val="0"/>
                 <w:color w:val="FFFFFF"/>
                 <w:sz w:val="24"/>
+                <w:u w:val="none"/>
+                <w:rFonts w:ascii="Avenir Next" w:hAnsi="Avenir Next" w:cs="Avenir Next"/>
               </w:rPr>
-              <w:t>CAUSES CHANGE</w:t>
+              <w:t>CHANGE</w:t>
             </w:r>
           </w:p>
         </w:tc>
         <w:tc>
           <w:tcPr>
-            <w:tcW w:type="dxa" w:w="560"/>
+            <w:tcW w:type="dxa" w:w="720"/>
             <w:tcMar>
               <w:top w:w="40" w:type="dxa"/>
-              <w:left w:w="8" w:type="dxa"/>
+              <w:left w:w="6" w:type="dxa"/>
               <w:bottom w:w="40" w:type="dxa"/>
-              <w:right w:w="8" w:type="dxa"/>
+              <w:right w:w="6" w:type="dxa"/>
             </w:tcMar>
             <w:vAlign w:val="center"/>
           </w:tcPr>
@@ -425,11 +1046,13 @@
             </w:pPr>
             <w:r>
               <w:rPr>
-                <w:rFonts w:ascii="Calibri" w:hAnsi="Calibri" w:cs="Calibri"/>
+                <w:rFonts w:ascii="Avenir Next" w:hAnsi="Avenir Next"/>
                 <w:b/>
                 <w:i w:val="0"/>
-                <w:color w:val="C03D3D"/>
+                <w:color w:val="0E8A97"/>
                 <w:sz w:val="28"/>
+                <w:u w:val="none"/>
+                <w:rFonts w:ascii="Avenir Next" w:hAnsi="Avenir Next" w:cs="Avenir Next"/>
               </w:rPr>
               <w:t>→</w:t>
             </w:r>
@@ -437,15 +1060,15 @@
         </w:tc>
         <w:tc>
           <w:tcPr>
-            <w:tcW w:type="dxa" w:w="2060"/>
+            <w:tcW w:type="dxa" w:w="3024"/>
             <w:tcMar>
               <w:top w:w="40" w:type="dxa"/>
-              <w:left w:w="8" w:type="dxa"/>
+              <w:left w:w="6" w:type="dxa"/>
               <w:bottom w:w="40" w:type="dxa"/>
-              <w:right w:w="8" w:type="dxa"/>
+              <w:right w:w="6" w:type="dxa"/>
             </w:tcMar>
             <w:vAlign w:val="center"/>
-            <w:shd w:fill="2F3C7E"/>
+            <w:shd w:val="clear" w:color="auto" w:fill="0F5A5C"/>
           </w:tcPr>
           <w:p>
             <w:pPr>
@@ -453,13 +1076,15 @@
             </w:pPr>
             <w:r>
               <w:rPr>
-                <w:rFonts w:ascii="Calibri" w:hAnsi="Calibri" w:cs="Calibri"/>
+                <w:rFonts w:ascii="Avenir Next" w:hAnsi="Avenir Next"/>
                 <w:b/>
                 <w:i w:val="0"/>
                 <w:color w:val="FFFFFF"/>
                 <w:sz w:val="24"/>
+                <w:u w:val="none"/>
+                <w:rFonts w:ascii="Avenir Next" w:hAnsi="Avenir Next" w:cs="Avenir Next"/>
               </w:rPr>
-              <w:t>EVIDENCE OF ENERGY</w:t>
+              <w:t>EVIDENCE</w:t>
             </w:r>
           </w:p>
         </w:tc>
@@ -467,38 +1092,12 @@
     </w:tbl>
     <w:p>
       <w:pPr>
-        <w:spacing w:after="40"/>
-      </w:pPr>
-    </w:p>
-    <w:p>
-      <w:pPr>
-        <w:spacing w:before="100" w:after="40"/>
+        <w:spacing w:before="0" w:after="120"/>
       </w:pPr>
       <w:r>
         <w:rPr>
-          <w:rFonts w:ascii="Calibri" w:hAnsi="Calibri" w:cs="Calibri"/>
-          <w:b/>
-          <w:i w:val="0"/>
-          <w:caps/>
-          <w:color w:val="2F3C7E"/>
-          <w:sz w:val="32"/>
+          <w:sz w:val="4"/>
         </w:rPr>
-        <w:t>Draw / Label</w:t>
-      </w:r>
-    </w:p>
-    <w:p>
-      <w:pPr>
-        <w:spacing w:before="0" w:after="20"/>
-      </w:pPr>
-      <w:r>
-        <w:rPr>
-          <w:rFonts w:ascii="Calibri" w:hAnsi="Calibri" w:cs="Calibri"/>
-          <w:b w:val="0"/>
-          <w:i w:val="0"/>
-          <w:color w:val="555555"/>
-          <w:sz w:val="24"/>
-        </w:rPr>
-        <w:t>Draw the marble before and after it hits the target. Use arrows to show the direction of motion.</w:t>
       </w:r>
     </w:p>
     <w:tbl>
@@ -506,25 +1105,96 @@
         <w:tblW w:type="auto" w:w="0"/>
         <w:tblLook w:firstColumn="1" w:firstRow="1" w:lastColumn="0" w:lastRow="0" w:noHBand="0" w:noVBand="1" w:val="04A0"/>
         <w:tblBorders>
-          <w:top w:val="none" w:sz="0" w:space="0" w:color="FFFFFF"/>
-          <w:left w:val="none" w:sz="0" w:space="0" w:color="FFFFFF"/>
-          <w:bottom w:val="none" w:sz="0" w:space="0" w:color="FFFFFF"/>
-          <w:right w:val="none" w:sz="0" w:space="0" w:color="FFFFFF"/>
-          <w:insideH w:val="none" w:sz="0" w:space="0" w:color="FFFFFF"/>
-          <w:insideV w:val="none" w:sz="0" w:space="0" w:color="FFFFFF"/>
+          <w:top w:val="none"/>
+          <w:left w:val="none"/>
+          <w:bottom w:val="none"/>
+          <w:right w:val="none"/>
+          <w:insideH w:val="none"/>
+          <w:insideV w:val="none"/>
         </w:tblBorders>
       </w:tblPr>
       <w:tblGrid>
-        <w:gridCol w:w="5040"/>
-        <w:gridCol w:w="5040"/>
+        <w:gridCol w:w="10656"/>
+      </w:tblGrid>
+      <w:tr>
+        <w:tc>
+          <w:tcPr>
+            <w:tcW w:type="dxa" w:w="10656"/>
+            <w:tcMar>
+              <w:top w:w="60" w:type="dxa"/>
+              <w:left w:w="110" w:type="dxa"/>
+              <w:bottom w:w="60" w:type="dxa"/>
+              <w:right w:w="110" w:type="dxa"/>
+            </w:tcMar>
+            <w:shd w:val="clear" w:color="auto" w:fill="F6F7F9"/>
+            <w:tcBorders>
+              <w:left w:val="single" w:sz="18" w:color="0E8A97"/>
+            </w:tcBorders>
+          </w:tcPr>
+          <w:p>
+            <w:r>
+              <w:rPr>
+                <w:rFonts w:ascii="Avenir Next" w:hAnsi="Avenir Next"/>
+                <w:b/>
+                <w:i w:val="0"/>
+                <w:color w:val="0E8A97"/>
+                <w:sz w:val="28"/>
+                <w:u w:val="none"/>
+                <w:rFonts w:ascii="Avenir Next" w:hAnsi="Avenir Next" w:cs="Avenir Next"/>
+              </w:rPr>
+              <w:t xml:space="preserve">OBSERVE   </w:t>
+            </w:r>
+            <w:r>
+              <w:rPr>
+                <w:rFonts w:ascii="Avenir Next" w:hAnsi="Avenir Next"/>
+                <w:b w:val="0"/>
+                <w:i w:val="0"/>
+                <w:color w:val="1A1D26"/>
+                <w:sz w:val="28"/>
+                <w:u w:val="none"/>
+                <w:rFonts w:ascii="Avenir Next" w:hAnsi="Avenir Next" w:cs="Avenir Next"/>
+              </w:rPr>
+              <w:t>Marble collision — one moving marble rolls into a target marble.</w:t>
+            </w:r>
+          </w:p>
+        </w:tc>
+      </w:tr>
+    </w:tbl>
+    <w:p>
+      <w:pPr>
+        <w:spacing w:before="0" w:after="80"/>
+      </w:pPr>
+      <w:r>
+        <w:rPr>
+          <w:sz w:val="4"/>
+        </w:rPr>
+      </w:r>
+    </w:p>
+    <w:tbl>
+      <w:tblPr>
+        <w:tblW w:type="auto" w:w="0"/>
+        <w:tblLook w:firstColumn="1" w:firstRow="1" w:lastColumn="0" w:lastRow="0" w:noHBand="0" w:noVBand="1" w:val="04A0"/>
+        <w:tblBorders>
+          <w:top w:val="none"/>
+          <w:left w:val="none"/>
+          <w:bottom w:val="none"/>
+          <w:right w:val="none"/>
+          <w:insideH w:val="none"/>
+          <w:insideV w:val="none"/>
+        </w:tblBorders>
+      </w:tblPr>
+      <w:tblGrid>
+        <w:gridCol w:w="5328"/>
+        <w:gridCol w:w="5328"/>
       </w:tblGrid>
       <w:tr>
         <w:trPr>
-          <w:trHeight w:val="2000" w:hRule="exact"/>
+          <w:trHeight w:val="3200" w:hRule="exact"/>
+          <w:trHeight w:val="3200" w:hRule="exact"/>
         </w:trPr>
         <w:tc>
           <w:tcPr>
-            <w:tcW w:type="dxa" w:w="4980"/>
+            <w:tcW w:type="dxa" w:w="5184"/>
             <w:tcMar>
               <w:top w:w="20" w:type="dxa"/>
               <w:left w:w="60" w:type="dxa"/>
@@ -532,10 +1202,16 @@
               <w:right w:w="60" w:type="dxa"/>
             </w:tcMar>
             <w:tcBorders>
-              <w:top w:sz="8" w:val="single" w:color="2F3C7E"/>
-              <w:left w:sz="8" w:val="single" w:color="2F3C7E"/>
-              <w:bottom w:sz="8" w:val="single" w:color="2F3C7E"/>
-              <w:right w:sz="8" w:val="single" w:color="2F3C7E"/>
+              <w:top w:val="single" w:sz="8" w:color="0F5A5C"/>
+            </w:tcBorders>
+            <w:tcBorders>
+              <w:left w:val="single" w:sz="8" w:color="0F5A5C"/>
+            </w:tcBorders>
+            <w:tcBorders>
+              <w:bottom w:val="single" w:sz="8" w:color="0F5A5C"/>
+            </w:tcBorders>
+            <w:tcBorders>
+              <w:right w:val="single" w:sz="8" w:color="0F5A5C"/>
             </w:tcBorders>
           </w:tcPr>
           <w:p>
@@ -544,35 +1220,21 @@
             </w:pPr>
             <w:r>
               <w:rPr>
-                <w:rFonts w:ascii="Calibri" w:hAnsi="Calibri" w:cs="Calibri"/>
+                <w:rFonts w:ascii="Avenir Next" w:hAnsi="Avenir Next"/>
                 <w:b/>
                 <w:i w:val="0"/>
-                <w:caps/>
-                <w:color w:val="C03D3D"/>
-                <w:sz w:val="26"/>
+                <w:color w:val="0E8A97"/>
+                <w:sz w:val="28"/>
+                <w:u w:val="none"/>
+                <w:rFonts w:ascii="Avenir Next" w:hAnsi="Avenir Next" w:cs="Avenir Next"/>
               </w:rPr>
               <w:t>BEFORE</w:t>
-            </w:r>
-          </w:p>
-          <w:p>
-            <w:pPr>
-              <w:jc w:val="center"/>
-            </w:pPr>
-            <w:r>
-              <w:rPr>
-                <w:rFonts w:ascii="Calibri" w:hAnsi="Calibri" w:cs="Calibri"/>
-                <w:b w:val="0"/>
-                <w:i/>
-                <w:color w:val="555555"/>
-                <w:sz w:val="24"/>
-              </w:rPr>
-              <w:t>marble rolls toward target</w:t>
             </w:r>
           </w:p>
         </w:tc>
         <w:tc>
           <w:tcPr>
-            <w:tcW w:type="dxa" w:w="4980"/>
+            <w:tcW w:type="dxa" w:w="5184"/>
             <w:tcMar>
               <w:top w:w="20" w:type="dxa"/>
               <w:left w:w="60" w:type="dxa"/>
@@ -580,10 +1242,16 @@
               <w:right w:w="60" w:type="dxa"/>
             </w:tcMar>
             <w:tcBorders>
-              <w:top w:sz="8" w:val="single" w:color="2F3C7E"/>
-              <w:left w:sz="8" w:val="single" w:color="2F3C7E"/>
-              <w:bottom w:sz="8" w:val="single" w:color="2F3C7E"/>
-              <w:right w:sz="8" w:val="single" w:color="2F3C7E"/>
+              <w:top w:val="single" w:sz="8" w:color="0F5A5C"/>
+            </w:tcBorders>
+            <w:tcBorders>
+              <w:left w:val="single" w:sz="8" w:color="0F5A5C"/>
+            </w:tcBorders>
+            <w:tcBorders>
+              <w:bottom w:val="single" w:sz="8" w:color="0F5A5C"/>
+            </w:tcBorders>
+            <w:tcBorders>
+              <w:right w:val="single" w:sz="8" w:color="0F5A5C"/>
             </w:tcBorders>
           </w:tcPr>
           <w:p>
@@ -592,29 +1260,15 @@
             </w:pPr>
             <w:r>
               <w:rPr>
-                <w:rFonts w:ascii="Calibri" w:hAnsi="Calibri" w:cs="Calibri"/>
+                <w:rFonts w:ascii="Avenir Next" w:hAnsi="Avenir Next"/>
                 <w:b/>
                 <w:i w:val="0"/>
-                <w:caps/>
-                <w:color w:val="C03D3D"/>
-                <w:sz w:val="26"/>
+                <w:color w:val="0E8A97"/>
+                <w:sz w:val="28"/>
+                <w:u w:val="none"/>
+                <w:rFonts w:ascii="Avenir Next" w:hAnsi="Avenir Next" w:cs="Avenir Next"/>
               </w:rPr>
               <w:t>AFTER</w:t>
-            </w:r>
-          </w:p>
-          <w:p>
-            <w:pPr>
-              <w:jc w:val="center"/>
-            </w:pPr>
-            <w:r>
-              <w:rPr>
-                <w:rFonts w:ascii="Calibri" w:hAnsi="Calibri" w:cs="Calibri"/>
-                <w:b w:val="0"/>
-                <w:i/>
-                <w:color w:val="555555"/>
-                <w:sz w:val="24"/>
-              </w:rPr>
-              <w:t>target moves after contact</w:t>
             </w:r>
           </w:p>
         </w:tc>
@@ -622,137 +1276,29 @@
     </w:tbl>
     <w:p>
       <w:pPr>
-        <w:spacing w:after="60"/>
+        <w:spacing w:before="0" w:after="80"/>
       </w:pPr>
       <w:r>
         <w:rPr>
-          <w:rFonts w:ascii="Calibri" w:hAnsi="Calibri" w:cs="Calibri"/>
-          <w:b w:val="0"/>
-          <w:i w:val="0"/>
-          <w:color w:val="1F1F1F"/>
-          <w:sz w:val="24"/>
+          <w:sz w:val="4"/>
         </w:rPr>
-        <w:t xml:space="preserve">What changed? </w:t>
-      </w:r>
-      <w:r>
-        <w:rPr>
-          <w:rFonts w:ascii="Calibri" w:hAnsi="Calibri" w:cs="Calibri"/>
-          <w:b w:val="0"/>
-          <w:i w:val="0"/>
-          <w:color w:val="1F1F1F"/>
-          <w:sz w:val="24"/>
-          <w:u w:val="single"/>
-        </w:rPr>
-        <w:t>________________________________________________</w:t>
       </w:r>
     </w:p>
     <w:p>
       <w:pPr>
-        <w:pageBreakBefore/>
-        <w:jc w:val="center"/>
+        <w:spacing w:before="0" w:after="80"/>
       </w:pPr>
       <w:r>
         <w:rPr>
-          <w:rFonts w:ascii="Cambria" w:hAnsi="Cambria" w:cs="Cambria"/>
+          <w:rFonts w:ascii="Avenir Next" w:hAnsi="Avenir Next"/>
           <w:b/>
           <w:i w:val="0"/>
-          <w:color w:val="2F3C7E"/>
-          <w:sz w:val="46"/>
+          <w:color w:val="1A1D26"/>
+          <w:sz w:val="28"/>
+          <w:u w:val="none"/>
+          <w:rFonts w:ascii="Avenir Next" w:hAnsi="Avenir Next" w:cs="Avenir Next"/>
         </w:rPr>
-        <w:t>Evidence + Lab Connection</w:t>
-      </w:r>
-    </w:p>
-    <w:p>
-      <w:pPr>
-        <w:jc w:val="center"/>
-      </w:pPr>
-      <w:r>
-        <w:rPr>
-          <w:rFonts w:ascii="Calibri" w:hAnsi="Calibri" w:cs="Calibri"/>
-          <w:b w:val="0"/>
-          <w:i/>
-          <w:color w:val="555555"/>
-          <w:sz w:val="24"/>
-        </w:rPr>
-        <w:t>Chapter 2 Guided Notes · Page 2</w:t>
-      </w:r>
-    </w:p>
-    <w:p>
-      <w:pPr>
-        <w:spacing w:after="40"/>
-      </w:pPr>
-      <w:r>
-        <w:rPr>
-          <w:rFonts w:ascii="Calibri" w:hAnsi="Calibri" w:cs="Calibri"/>
-          <w:b/>
-          <w:i w:val="0"/>
-          <w:color w:val="1F1F1F"/>
-          <w:sz w:val="24"/>
-        </w:rPr>
-        <w:t xml:space="preserve">Name: </w:t>
-      </w:r>
-      <w:r>
-        <w:rPr>
-          <w:rFonts w:ascii="Calibri" w:hAnsi="Calibri" w:cs="Calibri"/>
-          <w:b w:val="0"/>
-          <w:i w:val="0"/>
-          <w:color w:val="1F1F1F"/>
-          <w:sz w:val="24"/>
-          <w:u w:val="single"/>
-        </w:rPr>
-        <w:t>____________________________</w:t>
-      </w:r>
-      <w:r>
-        <w:rPr>
-          <w:rFonts w:ascii="Calibri" w:hAnsi="Calibri" w:cs="Calibri"/>
-          <w:b/>
-          <w:i w:val="0"/>
-          <w:color w:val="1F1F1F"/>
-          <w:sz w:val="24"/>
-        </w:rPr>
-        <w:t xml:space="preserve">      Date: </w:t>
-      </w:r>
-      <w:r>
-        <w:rPr>
-          <w:rFonts w:ascii="Calibri" w:hAnsi="Calibri" w:cs="Calibri"/>
-          <w:b w:val="0"/>
-          <w:i w:val="0"/>
-          <w:color w:val="1F1F1F"/>
-          <w:sz w:val="24"/>
-          <w:u w:val="single"/>
-        </w:rPr>
-        <w:t>________________</w:t>
-      </w:r>
-    </w:p>
-    <w:p>
-      <w:pPr>
-        <w:spacing w:before="100" w:after="40"/>
-      </w:pPr>
-      <w:r>
-        <w:rPr>
-          <w:rFonts w:ascii="Calibri" w:hAnsi="Calibri" w:cs="Calibri"/>
-          <w:b/>
-          <w:i w:val="0"/>
-          <w:caps/>
-          <w:color w:val="2F3C7E"/>
-          <w:sz w:val="32"/>
-        </w:rPr>
-        <w:t>Observation vs Inference</w:t>
-      </w:r>
-    </w:p>
-    <w:p>
-      <w:pPr>
-        <w:spacing w:before="0" w:after="20"/>
-      </w:pPr>
-      <w:r>
-        <w:rPr>
-          <w:rFonts w:ascii="Calibri" w:hAnsi="Calibri" w:cs="Calibri"/>
-          <w:b w:val="0"/>
-          <w:i w:val="0"/>
-          <w:color w:val="555555"/>
-          <w:sz w:val="24"/>
-        </w:rPr>
-        <w:t>Observation = what I saw.      Inference = what I think it means.</w:t>
+        <w:t>What changed?</w:t>
       </w:r>
     </w:p>
     <w:tbl>
@@ -760,17 +1306,204 @@
         <w:tblW w:type="auto" w:w="0"/>
         <w:tblLook w:firstColumn="1" w:firstRow="1" w:lastColumn="0" w:lastRow="0" w:noHBand="0" w:noVBand="1" w:val="04A0"/>
         <w:tblBorders>
-          <w:top w:val="none" w:sz="0" w:space="0" w:color="FFFFFF"/>
-          <w:left w:val="none" w:sz="0" w:space="0" w:color="FFFFFF"/>
-          <w:bottom w:val="none" w:sz="0" w:space="0" w:color="FFFFFF"/>
-          <w:right w:val="none" w:sz="0" w:space="0" w:color="FFFFFF"/>
-          <w:insideH w:val="none" w:sz="0" w:space="0" w:color="FFFFFF"/>
-          <w:insideV w:val="none" w:sz="0" w:space="0" w:color="FFFFFF"/>
+          <w:top w:val="none"/>
+          <w:left w:val="none"/>
+          <w:bottom w:val="none"/>
+          <w:right w:val="none"/>
+          <w:insideH w:val="none"/>
+          <w:insideV w:val="none"/>
         </w:tblBorders>
       </w:tblPr>
       <w:tblGrid>
-        <w:gridCol w:w="5040"/>
-        <w:gridCol w:w="5040"/>
+        <w:gridCol w:w="10656"/>
+      </w:tblGrid>
+      <w:tr>
+        <w:trPr>
+          <w:trHeight w:val="560" w:hRule="exact"/>
+        </w:trPr>
+        <w:tc>
+          <w:tcPr>
+            <w:tcW w:type="dxa" w:w="10656"/>
+            <w:tcMar>
+              <w:top w:w="0" w:type="dxa"/>
+              <w:left w:w="0" w:type="dxa"/>
+              <w:bottom w:w="0" w:type="dxa"/>
+              <w:right w:w="0" w:type="dxa"/>
+            </w:tcMar>
+            <w:tcBorders>
+              <w:bottom w:val="single" w:sz="8" w:color="1A1D26"/>
+            </w:tcBorders>
+          </w:tcPr>
+          <w:p>
+            <w:pPr>
+              <w:spacing w:before="0" w:after="0" w:line="40" w:lineRule="exact"/>
+            </w:pPr>
+            <w:r>
+              <w:rPr>
+                <w:rFonts w:ascii="Avenir Next" w:hAnsi="Avenir Next"/>
+                <w:b w:val="0"/>
+                <w:i w:val="0"/>
+                <w:color w:val="1A1D26"/>
+                <w:sz w:val="4"/>
+                <w:u w:val="none"/>
+                <w:rFonts w:ascii="Avenir Next" w:hAnsi="Avenir Next" w:cs="Avenir Next"/>
+              </w:rPr>
+            </w:r>
+          </w:p>
+        </w:tc>
+      </w:tr>
+      <w:tr>
+        <w:trPr>
+          <w:trHeight w:val="560" w:hRule="exact"/>
+        </w:trPr>
+        <w:tc>
+          <w:tcPr>
+            <w:tcW w:type="dxa" w:w="10656"/>
+            <w:tcMar>
+              <w:top w:w="0" w:type="dxa"/>
+              <w:left w:w="0" w:type="dxa"/>
+              <w:bottom w:w="0" w:type="dxa"/>
+              <w:right w:w="0" w:type="dxa"/>
+            </w:tcMar>
+            <w:tcBorders>
+              <w:bottom w:val="single" w:sz="8" w:color="1A1D26"/>
+            </w:tcBorders>
+          </w:tcPr>
+          <w:p>
+            <w:pPr>
+              <w:spacing w:before="0" w:after="0" w:line="40" w:lineRule="exact"/>
+            </w:pPr>
+            <w:r>
+              <w:rPr>
+                <w:rFonts w:ascii="Avenir Next" w:hAnsi="Avenir Next"/>
+                <w:b w:val="0"/>
+                <w:i w:val="0"/>
+                <w:color w:val="1A1D26"/>
+                <w:sz w:val="4"/>
+                <w:u w:val="none"/>
+                <w:rFonts w:ascii="Avenir Next" w:hAnsi="Avenir Next" w:cs="Avenir Next"/>
+              </w:rPr>
+            </w:r>
+          </w:p>
+        </w:tc>
+      </w:tr>
+    </w:tbl>
+    <w:p>
+      <w:r>
+        <w:br w:type="page"/>
+      </w:r>
+    </w:p>
+    <w:tbl>
+      <w:tblPr>
+        <w:tblW w:type="auto" w:w="0"/>
+        <w:tblLook w:firstColumn="1" w:firstRow="1" w:lastColumn="0" w:lastRow="0" w:noHBand="0" w:noVBand="1" w:val="04A0"/>
+        <w:tblBorders>
+          <w:top w:val="none"/>
+          <w:left w:val="none"/>
+          <w:bottom w:val="none"/>
+          <w:right w:val="none"/>
+          <w:insideH w:val="none"/>
+          <w:insideV w:val="none"/>
+        </w:tblBorders>
+      </w:tblPr>
+      <w:tblGrid>
+        <w:gridCol w:w="10656"/>
+      </w:tblGrid>
+      <w:tr>
+        <w:tc>
+          <w:tcPr>
+            <w:tcW w:type="dxa" w:w="10656"/>
+            <w:tcMar>
+              <w:top w:w="12" w:type="dxa"/>
+              <w:left w:w="0" w:type="dxa"/>
+              <w:bottom w:w="18" w:type="dxa"/>
+              <w:right w:w="0" w:type="dxa"/>
+            </w:tcMar>
+          </w:tcPr>
+          <w:p>
+            <w:pPr>
+              <w:pBdr>
+                <w:bottom w:val="single" w:sz="10" w:color="0F5A5C"/>
+              </w:pBdr>
+            </w:pPr>
+            <w:r>
+              <w:rPr>
+                <w:rFonts w:ascii="Avenir Next" w:hAnsi="Avenir Next"/>
+                <w:b/>
+                <w:i w:val="0"/>
+                <w:color w:val="0E8A97"/>
+                <w:sz w:val="32"/>
+                <w:u w:val="none"/>
+                <w:rFonts w:ascii="Avenir Next" w:hAnsi="Avenir Next" w:cs="Avenir Next"/>
+              </w:rPr>
+              <w:t xml:space="preserve">N3   </w:t>
+            </w:r>
+            <w:r>
+              <w:rPr>
+                <w:rFonts w:ascii="Avenir Next" w:hAnsi="Avenir Next"/>
+                <w:b/>
+                <w:i w:val="0"/>
+                <w:color w:val="0F5A5C"/>
+                <w:sz w:val="32"/>
+                <w:u w:val="none"/>
+                <w:rFonts w:ascii="Avenir Next" w:hAnsi="Avenir Next" w:cs="Avenir Next"/>
+              </w:rPr>
+              <w:t>PEOPLE USE THE ENERGY OF MOTION</w:t>
+            </w:r>
+          </w:p>
+        </w:tc>
+      </w:tr>
+    </w:tbl>
+    <w:p>
+      <w:pPr>
+        <w:spacing w:before="0" w:after="80"/>
+      </w:pPr>
+      <w:r>
+        <w:rPr>
+          <w:rFonts w:ascii="Avenir Next" w:hAnsi="Avenir Next"/>
+          <w:b w:val="0"/>
+          <w:i/>
+          <w:color w:val="4A5268"/>
+          <w:sz w:val="19"/>
+          <w:u w:val="none"/>
+          <w:rFonts w:ascii="Avenir Next" w:hAnsi="Avenir Next" w:cs="Avenir Next"/>
+        </w:rPr>
+        <w:t>Reader pp. 10–12</w:t>
+      </w:r>
+    </w:p>
+    <w:p>
+      <w:pPr>
+        <w:spacing w:before="0" w:after="120"/>
+      </w:pPr>
+      <w:r>
+        <w:rPr>
+          <w:rFonts w:ascii="Avenir Next" w:hAnsi="Avenir Next"/>
+          <w:b w:val="0"/>
+          <w:i/>
+          <w:color w:val="4A5268"/>
+          <w:sz w:val="24"/>
+          <w:u w:val="none"/>
+          <w:rFonts w:ascii="Avenir Next" w:hAnsi="Avenir Next" w:cs="Avenir Next"/>
+        </w:rPr>
+        <w:t>Write or draw the change each moving object causes.</w:t>
+      </w:r>
+    </w:p>
+    <w:tbl>
+      <w:tblPr>
+        <w:tblW w:type="auto" w:w="0"/>
+        <w:tblLook w:firstColumn="1" w:firstRow="1" w:lastColumn="0" w:lastRow="0" w:noHBand="0" w:noVBand="1" w:val="04A0"/>
+        <w:tblBorders>
+          <w:top w:val="none"/>
+          <w:left w:val="none"/>
+          <w:bottom w:val="none"/>
+          <w:right w:val="none"/>
+          <w:insideH w:val="none"/>
+          <w:insideV w:val="none"/>
+        </w:tblBorders>
+      </w:tblPr>
+      <w:tblGrid>
+        <w:gridCol w:w="5328"/>
+        <w:gridCol w:w="5328"/>
       </w:tblGrid>
       <w:tr>
         <w:trPr>
@@ -778,177 +1511,294 @@
         </w:trPr>
         <w:tc>
           <w:tcPr>
-            <w:tcW w:type="dxa" w:w="3600"/>
+            <w:tcW w:type="dxa" w:w="3744"/>
             <w:tcMar>
               <w:top w:w="40" w:type="dxa"/>
-              <w:left w:w="60" w:type="dxa"/>
+              <w:left w:w="80" w:type="dxa"/>
               <w:bottom w:w="40" w:type="dxa"/>
-              <w:right w:w="60" w:type="dxa"/>
+              <w:right w:w="80" w:type="dxa"/>
             </w:tcMar>
-            <w:shd w:fill="2F3C7E"/>
+            <w:shd w:val="clear" w:color="auto" w:fill="0F5A5C"/>
+            <w:vAlign w:val="center"/>
           </w:tcPr>
           <w:p>
             <w:r>
               <w:rPr>
-                <w:rFonts w:ascii="Calibri" w:hAnsi="Calibri" w:cs="Calibri"/>
+                <w:rFonts w:ascii="Avenir Next" w:hAnsi="Avenir Next"/>
                 <w:b/>
                 <w:i w:val="0"/>
-                <w:caps/>
                 <w:color w:val="FFFFFF"/>
                 <w:sz w:val="24"/>
+                <w:u w:val="none"/>
+                <w:rFonts w:ascii="Avenir Next" w:hAnsi="Avenir Next" w:cs="Avenir Next"/>
               </w:rPr>
-              <w:t>Observation (what I saw)</w:t>
+              <w:t>MOVING OBJECT</w:t>
             </w:r>
           </w:p>
         </w:tc>
         <w:tc>
           <w:tcPr>
-            <w:tcW w:type="dxa" w:w="3600"/>
+            <w:tcW w:type="dxa" w:w="6912"/>
             <w:tcMar>
               <w:top w:w="40" w:type="dxa"/>
-              <w:left w:w="60" w:type="dxa"/>
+              <w:left w:w="80" w:type="dxa"/>
               <w:bottom w:w="40" w:type="dxa"/>
-              <w:right w:w="60" w:type="dxa"/>
+              <w:right w:w="80" w:type="dxa"/>
             </w:tcMar>
-            <w:shd w:fill="2F3C7E"/>
+            <w:shd w:val="clear" w:color="auto" w:fill="0F5A5C"/>
+            <w:vAlign w:val="center"/>
           </w:tcPr>
           <w:p>
             <w:r>
               <w:rPr>
-                <w:rFonts w:ascii="Calibri" w:hAnsi="Calibri" w:cs="Calibri"/>
+                <w:rFonts w:ascii="Avenir Next" w:hAnsi="Avenir Next"/>
                 <w:b/>
                 <w:i w:val="0"/>
-                <w:caps/>
                 <w:color w:val="FFFFFF"/>
                 <w:sz w:val="24"/>
+                <w:u w:val="none"/>
+                <w:rFonts w:ascii="Avenir Next" w:hAnsi="Avenir Next" w:cs="Avenir Next"/>
               </w:rPr>
-              <w:t>Inference (what I think)</w:t>
+              <w:t>WHAT CHANGE DOES IT CAUSE?</w:t>
             </w:r>
           </w:p>
         </w:tc>
       </w:tr>
       <w:tr>
         <w:trPr>
-          <w:trHeight w:val="660" w:hRule="atLeast"/>
+          <w:trHeight w:val="1200" w:hRule="atLeast"/>
         </w:trPr>
         <w:tc>
           <w:tcPr>
-            <w:tcW w:type="dxa" w:w="3600"/>
+            <w:tcW w:type="dxa" w:w="3744"/>
             <w:tcMar>
               <w:top w:w="40" w:type="dxa"/>
-              <w:left w:w="60" w:type="dxa"/>
+              <w:left w:w="80" w:type="dxa"/>
               <w:bottom w:w="40" w:type="dxa"/>
-              <w:right w:w="60" w:type="dxa"/>
+              <w:right w:w="80" w:type="dxa"/>
+            </w:tcMar>
+            <w:vAlign w:val="center"/>
+          </w:tcPr>
+          <w:p>
+            <w:r>
+              <w:rPr>
+                <w:rFonts w:ascii="Avenir Next" w:hAnsi="Avenir Next"/>
+                <w:b/>
+                <w:i w:val="0"/>
+                <w:color w:val="0F5A5C"/>
+                <w:sz w:val="28"/>
+                <w:u w:val="none"/>
+                <w:rFonts w:ascii="Avenir Next" w:hAnsi="Avenir Next" w:cs="Avenir Next"/>
+              </w:rPr>
+              <w:t>hammer (swinging)</w:t>
+            </w:r>
+          </w:p>
+        </w:tc>
+        <w:tc>
+          <w:tcPr>
+            <w:tcW w:type="dxa" w:w="6912"/>
+            <w:tcMar>
+              <w:top w:w="40" w:type="dxa"/>
+              <w:left w:w="80" w:type="dxa"/>
+              <w:bottom w:w="40" w:type="dxa"/>
+              <w:right w:w="80" w:type="dxa"/>
+            </w:tcMar>
+            <w:vAlign w:val="center"/>
+            <w:tcBorders>
+              <w:bottom w:val="single" w:sz="8" w:color="1A1D26"/>
+            </w:tcBorders>
+          </w:tcPr>
+          <w:p/>
+        </w:tc>
+      </w:tr>
+      <w:tr>
+        <w:trPr>
+          <w:trHeight w:val="1200" w:hRule="atLeast"/>
+        </w:trPr>
+        <w:tc>
+          <w:tcPr>
+            <w:tcW w:type="dxa" w:w="3744"/>
+            <w:tcMar>
+              <w:top w:w="40" w:type="dxa"/>
+              <w:left w:w="80" w:type="dxa"/>
+              <w:bottom w:w="40" w:type="dxa"/>
+              <w:right w:w="80" w:type="dxa"/>
+            </w:tcMar>
+            <w:vAlign w:val="center"/>
+          </w:tcPr>
+          <w:p>
+            <w:r>
+              <w:rPr>
+                <w:rFonts w:ascii="Avenir Next" w:hAnsi="Avenir Next"/>
+                <w:b/>
+                <w:i w:val="0"/>
+                <w:color w:val="0F5A5C"/>
+                <w:sz w:val="28"/>
+                <w:u w:val="none"/>
+                <w:rFonts w:ascii="Avenir Next" w:hAnsi="Avenir Next" w:cs="Avenir Next"/>
+              </w:rPr>
+              <w:t>pendulum (swinging)</w:t>
+            </w:r>
+          </w:p>
+        </w:tc>
+        <w:tc>
+          <w:tcPr>
+            <w:tcW w:type="dxa" w:w="6912"/>
+            <w:tcMar>
+              <w:top w:w="40" w:type="dxa"/>
+              <w:left w:w="80" w:type="dxa"/>
+              <w:bottom w:w="40" w:type="dxa"/>
+              <w:right w:w="80" w:type="dxa"/>
+            </w:tcMar>
+            <w:vAlign w:val="center"/>
+            <w:tcBorders>
+              <w:bottom w:val="single" w:sz="8" w:color="1A1D26"/>
+            </w:tcBorders>
+          </w:tcPr>
+          <w:p/>
+        </w:tc>
+      </w:tr>
+      <w:tr>
+        <w:trPr>
+          <w:trHeight w:val="1200" w:hRule="atLeast"/>
+        </w:trPr>
+        <w:tc>
+          <w:tcPr>
+            <w:tcW w:type="dxa" w:w="3744"/>
+            <w:tcMar>
+              <w:top w:w="40" w:type="dxa"/>
+              <w:left w:w="80" w:type="dxa"/>
+              <w:bottom w:w="40" w:type="dxa"/>
+              <w:right w:w="80" w:type="dxa"/>
+            </w:tcMar>
+            <w:vAlign w:val="center"/>
+          </w:tcPr>
+          <w:p>
+            <w:r>
+              <w:rPr>
+                <w:rFonts w:ascii="Avenir Next" w:hAnsi="Avenir Next"/>
+                <w:b/>
+                <w:i w:val="0"/>
+                <w:color w:val="0F5A5C"/>
+                <w:sz w:val="28"/>
+                <w:u w:val="none"/>
+                <w:rFonts w:ascii="Avenir Next" w:hAnsi="Avenir Next" w:cs="Avenir Next"/>
+              </w:rPr>
+              <w:t>wind (moving air)</w:t>
+            </w:r>
+          </w:p>
+        </w:tc>
+        <w:tc>
+          <w:tcPr>
+            <w:tcW w:type="dxa" w:w="6912"/>
+            <w:tcMar>
+              <w:top w:w="40" w:type="dxa"/>
+              <w:left w:w="80" w:type="dxa"/>
+              <w:bottom w:w="40" w:type="dxa"/>
+              <w:right w:w="80" w:type="dxa"/>
+            </w:tcMar>
+            <w:vAlign w:val="center"/>
+            <w:tcBorders>
+              <w:bottom w:val="single" w:sz="8" w:color="1A1D26"/>
+            </w:tcBorders>
+          </w:tcPr>
+          <w:p/>
+        </w:tc>
+      </w:tr>
+    </w:tbl>
+    <w:tbl>
+      <w:tblPr>
+        <w:tblW w:type="auto" w:w="0"/>
+        <w:tblLook w:firstColumn="1" w:firstRow="1" w:lastColumn="0" w:lastRow="0" w:noHBand="0" w:noVBand="1" w:val="04A0"/>
+        <w:tblBorders>
+          <w:top w:val="none"/>
+          <w:left w:val="none"/>
+          <w:bottom w:val="none"/>
+          <w:right w:val="none"/>
+          <w:insideH w:val="none"/>
+          <w:insideV w:val="none"/>
+        </w:tblBorders>
+      </w:tblPr>
+      <w:tblGrid>
+        <w:gridCol w:w="10656"/>
+      </w:tblGrid>
+      <w:tr>
+        <w:tc>
+          <w:tcPr>
+            <w:tcW w:type="dxa" w:w="10656"/>
+            <w:tcMar>
+              <w:top w:w="12" w:type="dxa"/>
+              <w:left w:w="0" w:type="dxa"/>
+              <w:bottom w:w="18" w:type="dxa"/>
+              <w:right w:w="0" w:type="dxa"/>
             </w:tcMar>
           </w:tcPr>
           <w:p>
             <w:pPr>
               <w:pBdr>
-                <w:bottom w:val="single" w:sz="8" w:space="4" w:color="1F1F1F"/>
+                <w:bottom w:val="single" w:sz="10" w:color="0F5A5C"/>
               </w:pBdr>
             </w:pPr>
             <w:r>
               <w:rPr>
-                <w:rFonts w:ascii="Calibri" w:hAnsi="Calibri" w:cs="Calibri"/>
+                <w:rFonts w:ascii="Avenir Next" w:hAnsi="Avenir Next"/>
                 <w:b/>
                 <w:i w:val="0"/>
-                <w:color w:val="2F3C7E"/>
-                <w:sz w:val="24"/>
+                <w:color w:val="0E8A97"/>
+                <w:sz w:val="28"/>
+                <w:u w:val="none"/>
+                <w:rFonts w:ascii="Avenir Next" w:hAnsi="Avenir Next" w:cs="Avenir Next"/>
               </w:rPr>
-              <w:t>The target marble moved.</w:t>
+              <w:t xml:space="preserve">CHECK   </w:t>
             </w:r>
-          </w:p>
-        </w:tc>
-        <w:tc>
-          <w:tcPr>
-            <w:tcW w:type="dxa" w:w="3600"/>
-            <w:tcMar>
-              <w:top w:w="40" w:type="dxa"/>
-              <w:left w:w="60" w:type="dxa"/>
-              <w:bottom w:w="40" w:type="dxa"/>
-              <w:right w:w="60" w:type="dxa"/>
-            </w:tcMar>
-          </w:tcPr>
-          <w:p>
-            <w:pPr>
-              <w:pBdr>
-                <w:bottom w:val="single" w:sz="8" w:space="4" w:color="1F1F1F"/>
-              </w:pBdr>
-            </w:pPr>
             <w:r>
               <w:rPr>
-                <w:rFonts w:ascii="Calibri" w:hAnsi="Calibri" w:cs="Calibri"/>
-                <w:b w:val="0"/>
+                <w:rFonts w:ascii="Avenir Next" w:hAnsi="Avenir Next"/>
+                <w:b/>
                 <w:i w:val="0"/>
-                <w:color w:val="555555"/>
-                <w:sz w:val="24"/>
+                <w:color w:val="0F5A5C"/>
+                <w:sz w:val="28"/>
+                <w:u w:val="none"/>
+                <w:rFonts w:ascii="Avenir Next" w:hAnsi="Avenir Next" w:cs="Avenir Next"/>
               </w:rPr>
-              <w:t>The moving marble had energy.</w:t>
+              <w:t>YOUR THINKING</w:t>
             </w:r>
-          </w:p>
-        </w:tc>
-      </w:tr>
-      <w:tr>
-        <w:trPr>
-          <w:trHeight w:val="660" w:hRule="atLeast"/>
-        </w:trPr>
-        <w:tc>
-          <w:tcPr>
-            <w:tcW w:type="dxa" w:w="3600"/>
-            <w:tcMar>
-              <w:top w:w="40" w:type="dxa"/>
-              <w:left w:w="60" w:type="dxa"/>
-              <w:bottom w:w="40" w:type="dxa"/>
-              <w:right w:w="60" w:type="dxa"/>
-            </w:tcMar>
-          </w:tcPr>
-          <w:p>
-            <w:pPr>
-              <w:pBdr>
-                <w:bottom w:val="single" w:sz="8" w:space="4" w:color="1F1F1F"/>
-              </w:pBdr>
-            </w:pPr>
-          </w:p>
-        </w:tc>
-        <w:tc>
-          <w:tcPr>
-            <w:tcW w:type="dxa" w:w="3600"/>
-            <w:tcMar>
-              <w:top w:w="40" w:type="dxa"/>
-              <w:left w:w="60" w:type="dxa"/>
-              <w:bottom w:w="40" w:type="dxa"/>
-              <w:right w:w="60" w:type="dxa"/>
-            </w:tcMar>
-          </w:tcPr>
-          <w:p>
-            <w:pPr>
-              <w:pBdr>
-                <w:bottom w:val="single" w:sz="8" w:space="4" w:color="1F1F1F"/>
-              </w:pBdr>
-            </w:pPr>
           </w:p>
         </w:tc>
       </w:tr>
     </w:tbl>
     <w:p>
       <w:pPr>
-        <w:spacing w:after="40"/>
+        <w:spacing w:before="0" w:after="120"/>
       </w:pPr>
+      <w:r>
+        <w:rPr>
+          <w:rFonts w:ascii="Avenir Next" w:hAnsi="Avenir Next"/>
+          <w:b/>
+          <w:i w:val="0"/>
+          <w:color w:val="1A1D26"/>
+          <w:sz w:val="29"/>
+          <w:u w:val="none"/>
+          <w:rFonts w:ascii="Avenir Next" w:hAnsi="Avenir Next" w:cs="Avenir Next"/>
+        </w:rPr>
+        <w:t>How do we know a moving object has energy?</w:t>
+      </w:r>
     </w:p>
     <w:p>
       <w:pPr>
-        <w:spacing w:before="100" w:after="40"/>
+        <w:spacing w:before="0" w:after="80"/>
       </w:pPr>
       <w:r>
         <w:rPr>
-          <w:rFonts w:ascii="Calibri" w:hAnsi="Calibri" w:cs="Calibri"/>
-          <w:b/>
-          <w:i w:val="0"/>
-          <w:caps/>
-          <w:color w:val="2F3C7E"/>
-          <w:sz w:val="32"/>
+          <w:rFonts w:ascii="Avenir Next" w:hAnsi="Avenir Next"/>
+          <w:b w:val="0"/>
+          <w:i/>
+          <w:color w:val="4A5268"/>
+          <w:sz w:val="24"/>
+          <w:u w:val="none"/>
+          <w:rFonts w:ascii="Avenir Next" w:hAnsi="Avenir Next" w:cs="Avenir Next"/>
         </w:rPr>
-        <w:t>Example / Non-Example</w:t>
+        <w:t>Start with: “We know because the moving object causes …”</w:t>
       </w:r>
     </w:p>
     <w:tbl>
@@ -956,190 +1806,96 @@
         <w:tblW w:type="auto" w:w="0"/>
         <w:tblLook w:firstColumn="1" w:firstRow="1" w:lastColumn="0" w:lastRow="0" w:noHBand="0" w:noVBand="1" w:val="04A0"/>
         <w:tblBorders>
-          <w:top w:val="none" w:sz="0" w:space="0" w:color="FFFFFF"/>
-          <w:left w:val="none" w:sz="0" w:space="0" w:color="FFFFFF"/>
-          <w:bottom w:val="none" w:sz="0" w:space="0" w:color="FFFFFF"/>
-          <w:right w:val="none" w:sz="0" w:space="0" w:color="FFFFFF"/>
-          <w:insideH w:val="none" w:sz="0" w:space="0" w:color="FFFFFF"/>
-          <w:insideV w:val="none" w:sz="0" w:space="0" w:color="FFFFFF"/>
+          <w:top w:val="none"/>
+          <w:left w:val="none"/>
+          <w:bottom w:val="none"/>
+          <w:right w:val="none"/>
+          <w:insideH w:val="none"/>
+          <w:insideV w:val="none"/>
         </w:tblBorders>
       </w:tblPr>
       <w:tblGrid>
-        <w:gridCol w:w="5040"/>
-        <w:gridCol w:w="5040"/>
+        <w:gridCol w:w="10656"/>
       </w:tblGrid>
       <w:tr>
         <w:trPr>
-          <w:trHeight w:val="420" w:hRule="exact"/>
+          <w:trHeight w:val="560" w:hRule="exact"/>
         </w:trPr>
         <w:tc>
           <w:tcPr>
-            <w:tcW w:type="dxa" w:w="3600"/>
+            <w:tcW w:type="dxa" w:w="10656"/>
             <w:tcMar>
-              <w:top w:w="40" w:type="dxa"/>
-              <w:left w:w="60" w:type="dxa"/>
-              <w:bottom w:w="40" w:type="dxa"/>
-              <w:right w:w="60" w:type="dxa"/>
+              <w:top w:w="0" w:type="dxa"/>
+              <w:left w:w="0" w:type="dxa"/>
+              <w:bottom w:w="0" w:type="dxa"/>
+              <w:right w:w="0" w:type="dxa"/>
             </w:tcMar>
-            <w:shd w:fill="2F3C7E"/>
+            <w:tcBorders>
+              <w:bottom w:val="single" w:sz="8" w:color="1A1D26"/>
+            </w:tcBorders>
           </w:tcPr>
           <w:p>
+            <w:pPr>
+              <w:spacing w:before="0" w:after="0" w:line="40" w:lineRule="exact"/>
+            </w:pPr>
             <w:r>
               <w:rPr>
-                <w:rFonts w:ascii="Calibri" w:hAnsi="Calibri" w:cs="Calibri"/>
-                <w:b/>
+                <w:rFonts w:ascii="Avenir Next" w:hAnsi="Avenir Next"/>
+                <w:b w:val="0"/>
                 <w:i w:val="0"/>
-                <w:caps/>
-                <w:color w:val="FFFFFF"/>
-                <w:sz w:val="24"/>
+                <w:color w:val="1A1D26"/>
+                <w:sz w:val="4"/>
+                <w:u w:val="none"/>
+                <w:rFonts w:ascii="Avenir Next" w:hAnsi="Avenir Next" w:cs="Avenir Next"/>
               </w:rPr>
-              <w:t>Shows energy of motion (example)</w:t>
-            </w:r>
-          </w:p>
-        </w:tc>
-        <w:tc>
-          <w:tcPr>
-            <w:tcW w:type="dxa" w:w="3600"/>
-            <w:tcMar>
-              <w:top w:w="40" w:type="dxa"/>
-              <w:left w:w="60" w:type="dxa"/>
-              <w:bottom w:w="40" w:type="dxa"/>
-              <w:right w:w="60" w:type="dxa"/>
-            </w:tcMar>
-            <w:shd w:fill="2F3C7E"/>
-          </w:tcPr>
-          <w:p>
-            <w:r>
-              <w:rPr>
-                <w:rFonts w:ascii="Calibri" w:hAnsi="Calibri" w:cs="Calibri"/>
-                <w:b/>
-                <w:i w:val="0"/>
-                <w:caps/>
-                <w:color w:val="FFFFFF"/>
-                <w:sz w:val="24"/>
-              </w:rPr>
-              <w:t>Does NOT (non-example)</w:t>
             </w:r>
           </w:p>
         </w:tc>
       </w:tr>
       <w:tr>
         <w:trPr>
-          <w:trHeight w:val="660" w:hRule="atLeast"/>
+          <w:trHeight w:val="560" w:hRule="exact"/>
         </w:trPr>
         <w:tc>
           <w:tcPr>
-            <w:tcW w:type="dxa" w:w="3600"/>
+            <w:tcW w:type="dxa" w:w="10656"/>
             <w:tcMar>
-              <w:top w:w="40" w:type="dxa"/>
-              <w:left w:w="60" w:type="dxa"/>
-              <w:bottom w:w="40" w:type="dxa"/>
-              <w:right w:w="60" w:type="dxa"/>
+              <w:top w:w="0" w:type="dxa"/>
+              <w:left w:w="0" w:type="dxa"/>
+              <w:bottom w:w="0" w:type="dxa"/>
+              <w:right w:w="0" w:type="dxa"/>
             </w:tcMar>
+            <w:tcBorders>
+              <w:bottom w:val="single" w:sz="8" w:color="1A1D26"/>
+            </w:tcBorders>
           </w:tcPr>
           <w:p>
             <w:pPr>
-              <w:pBdr>
-                <w:bottom w:val="single" w:sz="8" w:space="4" w:color="1F1F1F"/>
-              </w:pBdr>
+              <w:spacing w:before="0" w:after="0" w:line="40" w:lineRule="exact"/>
             </w:pPr>
-          </w:p>
-        </w:tc>
-        <w:tc>
-          <w:tcPr>
-            <w:tcW w:type="dxa" w:w="3600"/>
-            <w:tcMar>
-              <w:top w:w="40" w:type="dxa"/>
-              <w:left w:w="60" w:type="dxa"/>
-              <w:bottom w:w="40" w:type="dxa"/>
-              <w:right w:w="60" w:type="dxa"/>
-            </w:tcMar>
-          </w:tcPr>
-          <w:p>
-            <w:pPr>
-              <w:pBdr>
-                <w:bottom w:val="single" w:sz="8" w:space="4" w:color="1F1F1F"/>
-              </w:pBdr>
-            </w:pPr>
-          </w:p>
-        </w:tc>
-      </w:tr>
-      <w:tr>
-        <w:trPr>
-          <w:trHeight w:val="660" w:hRule="atLeast"/>
-        </w:trPr>
-        <w:tc>
-          <w:tcPr>
-            <w:tcW w:type="dxa" w:w="3600"/>
-            <w:tcMar>
-              <w:top w:w="40" w:type="dxa"/>
-              <w:left w:w="60" w:type="dxa"/>
-              <w:bottom w:w="40" w:type="dxa"/>
-              <w:right w:w="60" w:type="dxa"/>
-            </w:tcMar>
-          </w:tcPr>
-          <w:p>
-            <w:pPr>
-              <w:pBdr>
-                <w:bottom w:val="single" w:sz="8" w:space="4" w:color="1F1F1F"/>
-              </w:pBdr>
-            </w:pPr>
-          </w:p>
-        </w:tc>
-        <w:tc>
-          <w:tcPr>
-            <w:tcW w:type="dxa" w:w="3600"/>
-            <w:tcMar>
-              <w:top w:w="40" w:type="dxa"/>
-              <w:left w:w="60" w:type="dxa"/>
-              <w:bottom w:w="40" w:type="dxa"/>
-              <w:right w:w="60" w:type="dxa"/>
-            </w:tcMar>
-          </w:tcPr>
-          <w:p>
-            <w:pPr>
-              <w:pBdr>
-                <w:bottom w:val="single" w:sz="8" w:space="4" w:color="1F1F1F"/>
-              </w:pBdr>
-            </w:pPr>
+            <w:r>
+              <w:rPr>
+                <w:rFonts w:ascii="Avenir Next" w:hAnsi="Avenir Next"/>
+                <w:b w:val="0"/>
+                <w:i w:val="0"/>
+                <w:color w:val="1A1D26"/>
+                <w:sz w:val="4"/>
+                <w:u w:val="none"/>
+                <w:rFonts w:ascii="Avenir Next" w:hAnsi="Avenir Next" w:cs="Avenir Next"/>
+              </w:rPr>
+            </w:r>
           </w:p>
         </w:tc>
       </w:tr>
     </w:tbl>
     <w:p>
       <w:pPr>
-        <w:spacing w:after="40"/>
-      </w:pPr>
-    </w:p>
-    <w:p>
-      <w:pPr>
-        <w:spacing w:before="100" w:after="40"/>
+        <w:spacing w:before="0" w:after="80"/>
       </w:pPr>
       <w:r>
         <w:rPr>
-          <w:rFonts w:ascii="Calibri" w:hAnsi="Calibri" w:cs="Calibri"/>
-          <w:b/>
-          <w:i w:val="0"/>
-          <w:caps/>
-          <w:color w:val="2F3C7E"/>
-          <w:sz w:val="32"/>
+          <w:sz w:val="4"/>
         </w:rPr>
-        <w:t>Lab Connection — Moving Marbles</w:t>
-      </w:r>
-    </w:p>
-    <w:p>
-      <w:pPr>
-        <w:spacing w:before="0" w:after="20"/>
-      </w:pPr>
-      <w:r>
-        <w:rPr>
-          <w:rFonts w:ascii="Calibri" w:hAnsi="Calibri" w:cs="Calibri"/>
-          <w:b w:val="0"/>
-          <w:i w:val="0"/>
-          <w:color w:val="555555"/>
-          <w:sz w:val="24"/>
-        </w:rPr>
-        <w:t>Record one thing you observed and the evidence it gives.</w:t>
       </w:r>
     </w:p>
     <w:tbl>
@@ -1147,229 +1903,214 @@
         <w:tblW w:type="auto" w:w="0"/>
         <w:tblLook w:firstColumn="1" w:firstRow="1" w:lastColumn="0" w:lastRow="0" w:noHBand="0" w:noVBand="1" w:val="04A0"/>
         <w:tblBorders>
-          <w:top w:val="none" w:sz="0" w:space="0" w:color="FFFFFF"/>
-          <w:left w:val="none" w:sz="0" w:space="0" w:color="FFFFFF"/>
-          <w:bottom w:val="none" w:sz="0" w:space="0" w:color="FFFFFF"/>
-          <w:right w:val="none" w:sz="0" w:space="0" w:color="FFFFFF"/>
-          <w:insideH w:val="none" w:sz="0" w:space="0" w:color="FFFFFF"/>
-          <w:insideV w:val="none" w:sz="0" w:space="0" w:color="FFFFFF"/>
+          <w:top w:val="none"/>
+          <w:left w:val="none"/>
+          <w:bottom w:val="none"/>
+          <w:right w:val="none"/>
+          <w:insideH w:val="none"/>
+          <w:insideV w:val="none"/>
         </w:tblBorders>
       </w:tblPr>
       <w:tblGrid>
-        <w:gridCol w:w="5040"/>
-        <w:gridCol w:w="5040"/>
+        <w:gridCol w:w="10656"/>
       </w:tblGrid>
       <w:tr>
-        <w:trPr>
-          <w:trHeight w:val="420" w:hRule="exact"/>
-        </w:trPr>
         <w:tc>
           <w:tcPr>
-            <w:tcW w:type="dxa" w:w="3600"/>
+            <w:tcW w:type="dxa" w:w="10656"/>
             <w:tcMar>
-              <w:top w:w="40" w:type="dxa"/>
-              <w:left w:w="60" w:type="dxa"/>
-              <w:bottom w:w="40" w:type="dxa"/>
-              <w:right w:w="60" w:type="dxa"/>
+              <w:top w:w="70" w:type="dxa"/>
+              <w:left w:w="110" w:type="dxa"/>
+              <w:bottom w:w="70" w:type="dxa"/>
+              <w:right w:w="110" w:type="dxa"/>
             </w:tcMar>
-            <w:shd w:fill="2F3C7E"/>
+            <w:shd w:val="clear" w:color="auto" w:fill="0F5A5C"/>
+            <w:vAlign w:val="center"/>
           </w:tcPr>
           <w:p>
             <w:r>
               <w:rPr>
-                <w:rFonts w:ascii="Calibri" w:hAnsi="Calibri" w:cs="Calibri"/>
+                <w:rFonts w:ascii="Avenir Next" w:hAnsi="Avenir Next"/>
                 <w:b/>
                 <w:i w:val="0"/>
-                <w:caps/>
                 <w:color w:val="FFFFFF"/>
-                <w:sz w:val="24"/>
+                <w:sz w:val="30"/>
+                <w:u w:val="none"/>
+                <w:rFonts w:ascii="Avenir Next" w:hAnsi="Avenir Next" w:cs="Avenir Next"/>
               </w:rPr>
-              <w:t>What I observed</w:t>
+              <w:t>BQ · NOW I THINK   How are energy, change, and movement of objects related?</w:t>
             </w:r>
           </w:p>
         </w:tc>
+      </w:tr>
+    </w:tbl>
+    <w:p>
+      <w:pPr>
+        <w:spacing w:before="0" w:after="80"/>
+      </w:pPr>
+      <w:r>
+        <w:rPr>
+          <w:sz w:val="4"/>
+        </w:rPr>
+      </w:r>
+    </w:p>
+    <w:tbl>
+      <w:tblPr>
+        <w:tblW w:type="auto" w:w="0"/>
+        <w:tblLook w:firstColumn="1" w:firstRow="1" w:lastColumn="0" w:lastRow="0" w:noHBand="0" w:noVBand="1" w:val="04A0"/>
+        <w:tblBorders>
+          <w:top w:val="none"/>
+          <w:left w:val="none"/>
+          <w:bottom w:val="none"/>
+          <w:right w:val="none"/>
+          <w:insideH w:val="none"/>
+          <w:insideV w:val="none"/>
+        </w:tblBorders>
+      </w:tblPr>
+      <w:tblGrid>
+        <w:gridCol w:w="10656"/>
+      </w:tblGrid>
+      <w:tr>
+        <w:trPr>
+          <w:trHeight w:val="560" w:hRule="exact"/>
+        </w:trPr>
         <w:tc>
           <w:tcPr>
-            <w:tcW w:type="dxa" w:w="3600"/>
+            <w:tcW w:type="dxa" w:w="10656"/>
             <w:tcMar>
-              <w:top w:w="40" w:type="dxa"/>
-              <w:left w:w="60" w:type="dxa"/>
-              <w:bottom w:w="40" w:type="dxa"/>
-              <w:right w:w="60" w:type="dxa"/>
+              <w:top w:w="0" w:type="dxa"/>
+              <w:left w:w="0" w:type="dxa"/>
+              <w:bottom w:w="0" w:type="dxa"/>
+              <w:right w:w="0" w:type="dxa"/>
             </w:tcMar>
-            <w:shd w:fill="2F3C7E"/>
+            <w:tcBorders>
+              <w:bottom w:val="single" w:sz="8" w:color="1A1D26"/>
+            </w:tcBorders>
           </w:tcPr>
           <w:p>
+            <w:pPr>
+              <w:spacing w:before="0" w:after="0" w:line="40" w:lineRule="exact"/>
+            </w:pPr>
             <w:r>
               <w:rPr>
-                <w:rFonts w:ascii="Calibri" w:hAnsi="Calibri" w:cs="Calibri"/>
-                <w:b/>
+                <w:rFonts w:ascii="Avenir Next" w:hAnsi="Avenir Next"/>
+                <w:b w:val="0"/>
                 <w:i w:val="0"/>
-                <w:caps/>
-                <w:color w:val="FFFFFF"/>
-                <w:sz w:val="24"/>
+                <w:color w:val="1A1D26"/>
+                <w:sz w:val="4"/>
+                <w:u w:val="none"/>
+                <w:rFonts w:ascii="Avenir Next" w:hAnsi="Avenir Next" w:cs="Avenir Next"/>
               </w:rPr>
-              <w:t>Evidence that the moving object had energy</w:t>
             </w:r>
           </w:p>
         </w:tc>
       </w:tr>
       <w:tr>
         <w:trPr>
-          <w:trHeight w:val="700" w:hRule="atLeast"/>
+          <w:trHeight w:val="560" w:hRule="exact"/>
         </w:trPr>
         <w:tc>
           <w:tcPr>
-            <w:tcW w:type="dxa" w:w="3600"/>
+            <w:tcW w:type="dxa" w:w="10656"/>
             <w:tcMar>
-              <w:top w:w="40" w:type="dxa"/>
-              <w:left w:w="60" w:type="dxa"/>
-              <w:bottom w:w="40" w:type="dxa"/>
-              <w:right w:w="60" w:type="dxa"/>
+              <w:top w:w="0" w:type="dxa"/>
+              <w:left w:w="0" w:type="dxa"/>
+              <w:bottom w:w="0" w:type="dxa"/>
+              <w:right w:w="0" w:type="dxa"/>
             </w:tcMar>
+            <w:tcBorders>
+              <w:bottom w:val="single" w:sz="8" w:color="1A1D26"/>
+            </w:tcBorders>
           </w:tcPr>
           <w:p>
             <w:pPr>
-              <w:pBdr>
-                <w:bottom w:val="single" w:sz="8" w:space="4" w:color="1F1F1F"/>
-              </w:pBdr>
+              <w:spacing w:before="0" w:after="0" w:line="40" w:lineRule="exact"/>
             </w:pPr>
+            <w:r>
+              <w:rPr>
+                <w:rFonts w:ascii="Avenir Next" w:hAnsi="Avenir Next"/>
+                <w:b w:val="0"/>
+                <w:i w:val="0"/>
+                <w:color w:val="1A1D26"/>
+                <w:sz w:val="4"/>
+                <w:u w:val="none"/>
+                <w:rFonts w:ascii="Avenir Next" w:hAnsi="Avenir Next" w:cs="Avenir Next"/>
+              </w:rPr>
+            </w:r>
           </w:p>
         </w:tc>
+      </w:tr>
+      <w:tr>
+        <w:trPr>
+          <w:trHeight w:val="560" w:hRule="exact"/>
+        </w:trPr>
         <w:tc>
           <w:tcPr>
-            <w:tcW w:type="dxa" w:w="3600"/>
+            <w:tcW w:type="dxa" w:w="10656"/>
             <w:tcMar>
-              <w:top w:w="40" w:type="dxa"/>
-              <w:left w:w="60" w:type="dxa"/>
-              <w:bottom w:w="40" w:type="dxa"/>
-              <w:right w:w="60" w:type="dxa"/>
+              <w:top w:w="0" w:type="dxa"/>
+              <w:left w:w="0" w:type="dxa"/>
+              <w:bottom w:w="0" w:type="dxa"/>
+              <w:right w:w="0" w:type="dxa"/>
             </w:tcMar>
+            <w:tcBorders>
+              <w:bottom w:val="single" w:sz="8" w:color="1A1D26"/>
+            </w:tcBorders>
           </w:tcPr>
           <w:p>
             <w:pPr>
-              <w:pBdr>
-                <w:bottom w:val="single" w:sz="8" w:space="4" w:color="1F1F1F"/>
-              </w:pBdr>
+              <w:spacing w:before="0" w:after="0" w:line="40" w:lineRule="exact"/>
             </w:pPr>
-          </w:p>
-        </w:tc>
-      </w:tr>
-    </w:tbl>
-    <w:p>
-      <w:pPr>
-        <w:spacing w:after="40"/>
-      </w:pPr>
-    </w:p>
-    <w:p>
-      <w:pPr>
-        <w:spacing w:before="100" w:after="40"/>
-      </w:pPr>
-      <w:r>
-        <w:rPr>
-          <w:rFonts w:ascii="Calibri" w:hAnsi="Calibri" w:cs="Calibri"/>
-          <w:b/>
-          <w:i w:val="0"/>
-          <w:caps/>
-          <w:color w:val="2F3C7E"/>
-          <w:sz w:val="32"/>
-        </w:rPr>
-        <w:t>Check Your Thinking</w:t>
-      </w:r>
-    </w:p>
-    <w:p>
-      <w:pPr>
-        <w:spacing w:before="0" w:after="30"/>
-      </w:pPr>
-      <w:r>
-        <w:rPr>
-          <w:rFonts w:ascii="Calibri" w:hAnsi="Calibri" w:cs="Calibri"/>
-          <w:b/>
-          <w:i w:val="0"/>
-          <w:color w:val="1F1F1F"/>
-          <w:sz w:val="26"/>
-        </w:rPr>
-        <w:t>How do we know a moving object has energy, even though we cannot see the energy?</w:t>
-      </w:r>
-    </w:p>
-    <w:p>
-      <w:pPr>
-        <w:spacing w:after="360" w:line="600" w:lineRule="exact"/>
-        <w:pBdr>
-          <w:bottom w:val="single" w:sz="8" w:space="4" w:color="1F1F1F"/>
-        </w:pBdr>
-      </w:pPr>
-    </w:p>
-    <w:p>
-      <w:pPr>
-        <w:spacing w:after="360" w:line="600" w:lineRule="exact"/>
-        <w:pBdr>
-          <w:bottom w:val="single" w:sz="8" w:space="4" w:color="1F1F1F"/>
-        </w:pBdr>
-      </w:pPr>
-    </w:p>
-    <w:tbl>
-      <w:tblPr>
-        <w:tblW w:type="auto" w:w="0"/>
-        <w:tblLook w:firstColumn="1" w:firstRow="1" w:lastColumn="0" w:lastRow="0" w:noHBand="0" w:noVBand="1" w:val="04A0"/>
-        <w:tblBorders>
-          <w:top w:val="none" w:sz="0" w:space="0" w:color="FFFFFF"/>
-          <w:left w:val="none" w:sz="0" w:space="0" w:color="FFFFFF"/>
-          <w:bottom w:val="none" w:sz="0" w:space="0" w:color="FFFFFF"/>
-          <w:right w:val="none" w:sz="0" w:space="0" w:color="FFFFFF"/>
-          <w:insideH w:val="none" w:sz="0" w:space="0" w:color="FFFFFF"/>
-          <w:insideV w:val="none" w:sz="0" w:space="0" w:color="FFFFFF"/>
-        </w:tblBorders>
-      </w:tblPr>
-      <w:tblGrid>
-        <w:gridCol w:w="10080"/>
-      </w:tblGrid>
-      <w:tr>
-        <w:tc>
-          <w:tcPr>
-            <w:tcW w:type="dxa" w:w="10080"/>
-            <w:tcMar>
-              <w:top w:w="50" w:type="dxa"/>
-              <w:left w:w="100" w:type="dxa"/>
-              <w:bottom w:w="50" w:type="dxa"/>
-              <w:right w:w="100" w:type="dxa"/>
-            </w:tcMar>
-            <w:shd w:fill="E8EAF2"/>
-          </w:tcPr>
-          <w:p>
             <w:r>
               <w:rPr>
-                <w:rFonts w:ascii="Calibri" w:hAnsi="Calibri" w:cs="Calibri"/>
-                <w:b/>
+                <w:rFonts w:ascii="Avenir Next" w:hAnsi="Avenir Next"/>
+                <w:b w:val="0"/>
                 <w:i w:val="0"/>
-                <w:caps/>
-                <w:color w:val="2F3C7E"/>
-                <w:sz w:val="24"/>
+                <w:color w:val="1A1D26"/>
+                <w:sz w:val="4"/>
+                <w:u w:val="none"/>
+                <w:rFonts w:ascii="Avenir Next" w:hAnsi="Avenir Next" w:cs="Avenir Next"/>
               </w:rPr>
-              <w:t xml:space="preserve">CONNECT   </w:t>
-            </w:r>
-            <w:r>
-              <w:rPr>
-                <w:rFonts w:ascii="Calibri" w:hAnsi="Calibri" w:cs="Calibri"/>
-                <w:b w:val="0"/>
-                <w:i/>
-                <w:color w:val="1F1F1F"/>
-                <w:sz w:val="24"/>
-              </w:rPr>
-              <w:t>Chapter 1 → 2: energy can cause change; a moving object is one thing that has energy.</w:t>
             </w:r>
           </w:p>
         </w:tc>
       </w:tr>
     </w:tbl>
     <w:sectPr>
+      <w:footerReference w:type="default" r:id="rId9"/>
       <w:pgSz w:w="12240" w:h="15840"/>
-      <w:pgMar w:top="1008" w:right="1080" w:bottom="1008" w:left="1080" w:header="720" w:footer="720" w:gutter="0"/>
+      <w:pgMar w:top="720" w:right="792" w:bottom="720" w:left="792" w:header="720" w:footer="720" w:gutter="0"/>
       <w:cols w:space="720"/>
       <w:docGrid w:linePitch="360"/>
     </w:sectPr>
   </w:body>
 </w:document>
+</file>
+
+<file path=word/footer1.xml><?xml version="1.0" encoding="utf-8"?>
+<w:ftr xmlns:m="http://schemas.openxmlformats.org/officeDocument/2006/math" xmlns:mc="http://schemas.openxmlformats.org/markup-compatibility/2006" xmlns:mo="http://schemas.microsoft.com/office/mac/office/2008/main" xmlns:mv="urn:schemas-microsoft-com:mac:vml" xmlns:o="urn:schemas-microsoft-com:office:office" xmlns:r="http://schemas.openxmlformats.org/officeDocument/2006/relationships" xmlns:v="urn:schemas-microsoft-com:vml" xmlns:w10="urn:schemas-microsoft-com:office:word" xmlns:w14="http://schemas.microsoft.com/office/word/2010/wordml" xmlns:w="http://schemas.openxmlformats.org/wordprocessingml/2006/main" xmlns:wne="http://schemas.microsoft.com/office/word/2006/wordml" xmlns:wp14="http://schemas.microsoft.com/office/word/2010/wordprocessingDrawing" xmlns:wp="http://schemas.openxmlformats.org/drawingml/2006/wordprocessingDrawing" xmlns:wpc="http://schemas.microsoft.com/office/word/2010/wordprocessingCanvas" xmlns:wpg="http://schemas.microsoft.com/office/word/2010/wordprocessingGroup" xmlns:wpi="http://schemas.microsoft.com/office/word/2010/wordprocessingInk" xmlns:wps="http://schemas.microsoft.com/office/word/2010/wordprocessingShape" mc:Ignorable="w14 wp14">
+  <w:p>
+    <w:pPr>
+      <w:pStyle w:val="Footer"/>
+      <w:jc w:val="center"/>
+      <w:pBdr>
+        <w:top w:val="single" w:sz="6" w:color="D8DCE4"/>
+      </w:pBdr>
+    </w:pPr>
+    <w:r>
+      <w:rPr>
+        <w:rFonts w:ascii="Avenir Next" w:hAnsi="Avenir Next"/>
+        <w:b w:val="0"/>
+        <w:i w:val="0"/>
+        <w:color w:val="4A5268"/>
+        <w:sz w:val="17"/>
+        <w:u w:val="none"/>
+        <w:rFonts w:ascii="Avenir Next" w:hAnsi="Avenir Next" w:cs="Avenir Next"/>
+      </w:rPr>
+      <w:t>Unit 1 · Chapter 2 · Guided Notes · Moving Objects Have Energy</w:t>
+    </w:r>
+  </w:p>
+</w:ftr>
 </file>
 
 <file path=word/numbering.xml><?xml version="1.0" encoding="utf-8"?>
@@ -1735,6 +2476,11 @@
     <w:name w:val="Normal"/>
     <w:qFormat/>
     <w:rsid w:val="00FC693F"/>
+    <w:rPr>
+      <w:rFonts w:ascii="Avenir Next" w:hAnsi="Avenir Next"/>
+      <w:color w:val="1A1D26"/>
+      <w:sz w:val="28"/>
+    </w:rPr>
   </w:style>
   <w:style w:type="paragraph" w:styleId="Header">
     <w:name w:val="header"/>

</xml_diff>